<commit_message>
Add final presentation and revised proposal documents for the project on optimizing balanced meal composition using metaheuristic algorithms.
</commit_message>
<xml_diff>
--- a/laporan/L0122094_Mochamad Faisal Akbar_Makalah Projek Akhir.docx
+++ b/laporan/L0122094_Mochamad Faisal Akbar_Makalah Projek Akhir.docx
@@ -7217,23 +7217,7 @@
           <w:rFonts w:ascii="Times New Roman" w:hAnsi="Times New Roman" w:cs="Times New Roman"/>
           <w:color w:val="000000"/>
         </w:rPr>
-        <w:t xml:space="preserve"> per </w:t>
-      </w:r>
-      <w:proofErr w:type="gramStart"/>
-      <w:r>
-        <w:rPr>
-          <w:rFonts w:ascii="Times New Roman" w:hAnsi="Times New Roman" w:cs="Times New Roman"/>
-          <w:color w:val="000000"/>
-        </w:rPr>
-        <w:t>100 gram</w:t>
-      </w:r>
-      <w:proofErr w:type="gramEnd"/>
-      <w:r>
-        <w:rPr>
-          <w:rFonts w:ascii="Times New Roman" w:hAnsi="Times New Roman" w:cs="Times New Roman"/>
-          <w:color w:val="000000"/>
-        </w:rPr>
-        <w:t xml:space="preserve"> </w:t>
+        <w:t xml:space="preserve"> per 100 gram </w:t>
       </w:r>
       <w:proofErr w:type="spellStart"/>
       <w:r>
@@ -8700,7 +8684,39 @@
           <w:rFonts w:ascii="Times New Roman" w:hAnsi="Times New Roman" w:cs="Times New Roman"/>
           <w:color w:val="000000"/>
         </w:rPr>
-        <w:t xml:space="preserve"> dengan nilai minimum: </w:t>
+        <w:t xml:space="preserve"> </w:t>
+      </w:r>
+      <w:proofErr w:type="spellStart"/>
+      <w:r>
+        <w:rPr>
+          <w:rFonts w:ascii="Times New Roman" w:hAnsi="Times New Roman" w:cs="Times New Roman"/>
+          <w:color w:val="000000"/>
+        </w:rPr>
+        <w:t>dengan</w:t>
+      </w:r>
+      <w:proofErr w:type="spellEnd"/>
+      <w:r>
+        <w:rPr>
+          <w:rFonts w:ascii="Times New Roman" w:hAnsi="Times New Roman" w:cs="Times New Roman"/>
+          <w:color w:val="000000"/>
+        </w:rPr>
+        <w:t xml:space="preserve"> </w:t>
+      </w:r>
+      <w:proofErr w:type="spellStart"/>
+      <w:r>
+        <w:rPr>
+          <w:rFonts w:ascii="Times New Roman" w:hAnsi="Times New Roman" w:cs="Times New Roman"/>
+          <w:color w:val="000000"/>
+        </w:rPr>
+        <w:t>nilai</w:t>
+      </w:r>
+      <w:proofErr w:type="spellEnd"/>
+      <w:r>
+        <w:rPr>
+          <w:rFonts w:ascii="Times New Roman" w:hAnsi="Times New Roman" w:cs="Times New Roman"/>
+          <w:color w:val="000000"/>
+        </w:rPr>
+        <w:t xml:space="preserve"> minimum: </w:t>
       </w:r>
       <w:proofErr w:type="spellStart"/>
       <w:r>
@@ -10462,8 +10478,17 @@
           <w:rFonts w:ascii="Times New Roman" w:hAnsi="Times New Roman" w:cs="Times New Roman"/>
           <w:color w:val="000000"/>
         </w:rPr>
-        <w:t xml:space="preserve"> ditetapkan</w:t>
-      </w:r>
+        <w:t xml:space="preserve"> </w:t>
+      </w:r>
+      <w:proofErr w:type="spellStart"/>
+      <w:r>
+        <w:rPr>
+          <w:rFonts w:ascii="Times New Roman" w:hAnsi="Times New Roman" w:cs="Times New Roman"/>
+          <w:color w:val="000000"/>
+        </w:rPr>
+        <w:t>ditetapkan</w:t>
+      </w:r>
+      <w:proofErr w:type="spellEnd"/>
       <w:r>
         <w:rPr>
           <w:rFonts w:ascii="Times New Roman" w:hAnsi="Times New Roman" w:cs="Times New Roman"/>
@@ -14462,8 +14487,49 @@
           <w:rFonts w:ascii="Times New Roman" w:hAnsi="Times New Roman" w:cs="Times New Roman"/>
           <w:color w:val="000000"/>
         </w:rPr>
-        <w:t xml:space="preserve"> dari nilai saat</w:t>
-      </w:r>
+        <w:t xml:space="preserve"> </w:t>
+      </w:r>
+      <w:proofErr w:type="spellStart"/>
+      <w:r>
+        <w:rPr>
+          <w:rFonts w:ascii="Times New Roman" w:hAnsi="Times New Roman" w:cs="Times New Roman"/>
+          <w:color w:val="000000"/>
+        </w:rPr>
+        <w:t>dari</w:t>
+      </w:r>
+      <w:proofErr w:type="spellEnd"/>
+      <w:r>
+        <w:rPr>
+          <w:rFonts w:ascii="Times New Roman" w:hAnsi="Times New Roman" w:cs="Times New Roman"/>
+          <w:color w:val="000000"/>
+        </w:rPr>
+        <w:t xml:space="preserve"> </w:t>
+      </w:r>
+      <w:proofErr w:type="spellStart"/>
+      <w:r>
+        <w:rPr>
+          <w:rFonts w:ascii="Times New Roman" w:hAnsi="Times New Roman" w:cs="Times New Roman"/>
+          <w:color w:val="000000"/>
+        </w:rPr>
+        <w:t>nilai</w:t>
+      </w:r>
+      <w:proofErr w:type="spellEnd"/>
+      <w:r>
+        <w:rPr>
+          <w:rFonts w:ascii="Times New Roman" w:hAnsi="Times New Roman" w:cs="Times New Roman"/>
+          <w:color w:val="000000"/>
+        </w:rPr>
+        <w:t xml:space="preserve"> </w:t>
+      </w:r>
+      <w:proofErr w:type="spellStart"/>
+      <w:r>
+        <w:rPr>
+          <w:rFonts w:ascii="Times New Roman" w:hAnsi="Times New Roman" w:cs="Times New Roman"/>
+          <w:color w:val="000000"/>
+        </w:rPr>
+        <w:t>saat</w:t>
+      </w:r>
+      <w:proofErr w:type="spellEnd"/>
       <w:r>
         <w:rPr>
           <w:rFonts w:ascii="Times New Roman" w:hAnsi="Times New Roman" w:cs="Times New Roman"/>
@@ -17764,17 +17830,7 @@
                 <w:szCs w:val="18"/>
                 <w:lang w:val="sv-SE"/>
               </w:rPr>
-              <w:t>25</w:t>
-            </w:r>
-            <w:r>
-              <w:rPr>
-                <w:rFonts w:ascii="Times New Roman" w:hAnsi="Times New Roman" w:cs="Times New Roman"/>
-                <w:color w:val="000000"/>
-                <w:sz w:val="18"/>
-                <w:szCs w:val="18"/>
-                <w:lang w:val="sv-SE"/>
-              </w:rPr>
-              <w:t>,000</w:t>
+              <w:t>25,000</w:t>
             </w:r>
           </w:p>
         </w:tc>
@@ -17979,17 +18035,7 @@
                 <w:szCs w:val="18"/>
                 <w:lang w:val="sv-SE"/>
               </w:rPr>
-              <w:t>12</w:t>
-            </w:r>
-            <w:r>
-              <w:rPr>
-                <w:rFonts w:ascii="Times New Roman" w:hAnsi="Times New Roman" w:cs="Times New Roman"/>
-                <w:color w:val="000000"/>
-                <w:sz w:val="18"/>
-                <w:szCs w:val="18"/>
-                <w:lang w:val="sv-SE"/>
-              </w:rPr>
-              <w:t>,000</w:t>
+              <w:t>12,000</w:t>
             </w:r>
           </w:p>
         </w:tc>
@@ -18194,17 +18240,7 @@
                 <w:szCs w:val="18"/>
                 <w:lang w:val="sv-SE"/>
               </w:rPr>
-              <w:t>15</w:t>
-            </w:r>
-            <w:r>
-              <w:rPr>
-                <w:rFonts w:ascii="Times New Roman" w:hAnsi="Times New Roman" w:cs="Times New Roman"/>
-                <w:color w:val="000000"/>
-                <w:sz w:val="18"/>
-                <w:szCs w:val="18"/>
-                <w:lang w:val="sv-SE"/>
-              </w:rPr>
-              <w:t>,000</w:t>
+              <w:t>15,000</w:t>
             </w:r>
           </w:p>
         </w:tc>
@@ -18409,17 +18445,7 @@
                 <w:szCs w:val="18"/>
                 <w:lang w:val="sv-SE"/>
               </w:rPr>
-              <w:t>8</w:t>
-            </w:r>
-            <w:r>
-              <w:rPr>
-                <w:rFonts w:ascii="Times New Roman" w:hAnsi="Times New Roman" w:cs="Times New Roman"/>
-                <w:color w:val="000000"/>
-                <w:sz w:val="18"/>
-                <w:szCs w:val="18"/>
-                <w:lang w:val="sv-SE"/>
-              </w:rPr>
-              <w:t>,000</w:t>
+              <w:t>8,000</w:t>
             </w:r>
           </w:p>
         </w:tc>
@@ -18566,17 +18592,7 @@
                 <w:szCs w:val="18"/>
                 <w:lang w:val="sv-SE"/>
               </w:rPr>
-              <w:t>0.</w:t>
-            </w:r>
-            <w:r>
-              <w:rPr>
-                <w:rFonts w:ascii="Times New Roman" w:hAnsi="Times New Roman" w:cs="Times New Roman"/>
-                <w:color w:val="000000"/>
-                <w:sz w:val="18"/>
-                <w:szCs w:val="18"/>
-                <w:lang w:val="sv-SE"/>
-              </w:rPr>
-              <w:t>6</w:t>
+              <w:t>0.6</w:t>
             </w:r>
           </w:p>
         </w:tc>
@@ -18781,17 +18797,7 @@
                 <w:szCs w:val="18"/>
                 <w:lang w:val="sv-SE"/>
               </w:rPr>
-              <w:t>0.</w:t>
-            </w:r>
-            <w:r>
-              <w:rPr>
-                <w:rFonts w:ascii="Times New Roman" w:hAnsi="Times New Roman" w:cs="Times New Roman"/>
-                <w:color w:val="000000"/>
-                <w:sz w:val="18"/>
-                <w:szCs w:val="18"/>
-                <w:lang w:val="sv-SE"/>
-              </w:rPr>
-              <w:t>7</w:t>
+              <w:t>0.7</w:t>
             </w:r>
           </w:p>
         </w:tc>
@@ -18849,27 +18855,7 @@
                 <w:szCs w:val="18"/>
                 <w:lang w:val="sv-SE"/>
               </w:rPr>
-              <w:t>3</w:t>
-            </w:r>
-            <w:r>
-              <w:rPr>
-                <w:rFonts w:ascii="Times New Roman" w:hAnsi="Times New Roman" w:cs="Times New Roman"/>
-                <w:color w:val="000000"/>
-                <w:sz w:val="18"/>
-                <w:szCs w:val="18"/>
-                <w:lang w:val="sv-SE"/>
-              </w:rPr>
-              <w:t>5</w:t>
-            </w:r>
-            <w:r>
-              <w:rPr>
-                <w:rFonts w:ascii="Times New Roman" w:hAnsi="Times New Roman" w:cs="Times New Roman"/>
-                <w:color w:val="000000"/>
-                <w:sz w:val="18"/>
-                <w:szCs w:val="18"/>
-                <w:lang w:val="sv-SE"/>
-              </w:rPr>
-              <w:t>,000</w:t>
+              <w:t>35,000</w:t>
             </w:r>
           </w:p>
         </w:tc>
@@ -19016,17 +19002,7 @@
                 <w:szCs w:val="18"/>
                 <w:lang w:val="sv-SE"/>
               </w:rPr>
-              <w:t>0.</w:t>
-            </w:r>
-            <w:r>
-              <w:rPr>
-                <w:rFonts w:ascii="Times New Roman" w:hAnsi="Times New Roman" w:cs="Times New Roman"/>
-                <w:color w:val="000000"/>
-                <w:sz w:val="18"/>
-                <w:szCs w:val="18"/>
-                <w:lang w:val="sv-SE"/>
-              </w:rPr>
-              <w:t>8</w:t>
+              <w:t>0.8</w:t>
             </w:r>
           </w:p>
         </w:tc>
@@ -19084,17 +19060,7 @@
                 <w:szCs w:val="18"/>
                 <w:lang w:val="sv-SE"/>
               </w:rPr>
-              <w:t>1</w:t>
-            </w:r>
-            <w:r>
-              <w:rPr>
-                <w:rFonts w:ascii="Times New Roman" w:hAnsi="Times New Roman" w:cs="Times New Roman"/>
-                <w:color w:val="000000"/>
-                <w:sz w:val="18"/>
-                <w:szCs w:val="18"/>
-                <w:lang w:val="sv-SE"/>
-              </w:rPr>
-              <w:t>0,000</w:t>
+              <w:t>10,000</w:t>
             </w:r>
           </w:p>
         </w:tc>
@@ -19241,17 +19207,7 @@
                 <w:szCs w:val="18"/>
                 <w:lang w:val="sv-SE"/>
               </w:rPr>
-              <w:t>0.</w:t>
-            </w:r>
-            <w:r>
-              <w:rPr>
-                <w:rFonts w:ascii="Times New Roman" w:hAnsi="Times New Roman" w:cs="Times New Roman"/>
-                <w:color w:val="000000"/>
-                <w:sz w:val="18"/>
-                <w:szCs w:val="18"/>
-                <w:lang w:val="sv-SE"/>
-              </w:rPr>
-              <w:t>4</w:t>
+              <w:t>0.4</w:t>
             </w:r>
           </w:p>
         </w:tc>
@@ -19309,17 +19265,7 @@
                 <w:szCs w:val="18"/>
                 <w:lang w:val="sv-SE"/>
               </w:rPr>
-              <w:t>30</w:t>
-            </w:r>
-            <w:r>
-              <w:rPr>
-                <w:rFonts w:ascii="Times New Roman" w:hAnsi="Times New Roman" w:cs="Times New Roman"/>
-                <w:color w:val="000000"/>
-                <w:sz w:val="18"/>
-                <w:szCs w:val="18"/>
-                <w:lang w:val="sv-SE"/>
-              </w:rPr>
-              <w:t>,000</w:t>
+              <w:t>30,000</w:t>
             </w:r>
           </w:p>
         </w:tc>
@@ -19845,66 +19791,36 @@
                 <w:szCs w:val="18"/>
                 <w:lang w:val="sv-SE"/>
               </w:rPr>
-              <w:t>2</w:t>
-            </w:r>
-            <w:r>
-              <w:rPr>
-                <w:rFonts w:ascii="Times New Roman" w:hAnsi="Times New Roman" w:cs="Times New Roman"/>
-                <w:color w:val="000000"/>
-                <w:sz w:val="18"/>
-                <w:szCs w:val="18"/>
-                <w:lang w:val="sv-SE"/>
-              </w:rPr>
-              <w:t>8</w:t>
-            </w:r>
-            <w:r>
-              <w:rPr>
-                <w:rFonts w:ascii="Times New Roman" w:hAnsi="Times New Roman" w:cs="Times New Roman"/>
-                <w:color w:val="000000"/>
-                <w:sz w:val="18"/>
-                <w:szCs w:val="18"/>
-                <w:lang w:val="sv-SE"/>
-              </w:rPr>
-              <w:t>.0</w:t>
-            </w:r>
-          </w:p>
-        </w:tc>
-        <w:tc>
-          <w:tcPr>
-            <w:tcW w:w="1335" w:type="dxa"/>
-          </w:tcPr>
-          <w:p>
-            <w:pPr>
-              <w:autoSpaceDE w:val="0"/>
-              <w:spacing w:after="0" w:line="240" w:lineRule="auto"/>
-              <w:jc w:val="center"/>
-              <w:rPr>
-                <w:rFonts w:ascii="Times New Roman" w:hAnsi="Times New Roman" w:cs="Times New Roman"/>
-                <w:color w:val="000000"/>
-                <w:sz w:val="18"/>
-                <w:szCs w:val="18"/>
-                <w:lang w:val="sv-SE"/>
-              </w:rPr>
-            </w:pPr>
-            <w:r>
-              <w:rPr>
-                <w:rFonts w:ascii="Times New Roman" w:hAnsi="Times New Roman" w:cs="Times New Roman"/>
-                <w:color w:val="000000"/>
-                <w:sz w:val="18"/>
-                <w:szCs w:val="18"/>
-                <w:lang w:val="sv-SE"/>
-              </w:rPr>
-              <w:t>13</w:t>
-            </w:r>
-            <w:r>
-              <w:rPr>
-                <w:rFonts w:ascii="Times New Roman" w:hAnsi="Times New Roman" w:cs="Times New Roman"/>
-                <w:color w:val="000000"/>
-                <w:sz w:val="18"/>
-                <w:szCs w:val="18"/>
-                <w:lang w:val="sv-SE"/>
-              </w:rPr>
-              <w:t>,000</w:t>
+              <w:t>28.0</w:t>
+            </w:r>
+          </w:p>
+        </w:tc>
+        <w:tc>
+          <w:tcPr>
+            <w:tcW w:w="1335" w:type="dxa"/>
+          </w:tcPr>
+          <w:p>
+            <w:pPr>
+              <w:autoSpaceDE w:val="0"/>
+              <w:spacing w:after="0" w:line="240" w:lineRule="auto"/>
+              <w:jc w:val="center"/>
+              <w:rPr>
+                <w:rFonts w:ascii="Times New Roman" w:hAnsi="Times New Roman" w:cs="Times New Roman"/>
+                <w:color w:val="000000"/>
+                <w:sz w:val="18"/>
+                <w:szCs w:val="18"/>
+                <w:lang w:val="sv-SE"/>
+              </w:rPr>
+            </w:pPr>
+            <w:r>
+              <w:rPr>
+                <w:rFonts w:ascii="Times New Roman" w:hAnsi="Times New Roman" w:cs="Times New Roman"/>
+                <w:color w:val="000000"/>
+                <w:sz w:val="18"/>
+                <w:szCs w:val="18"/>
+                <w:lang w:val="sv-SE"/>
+              </w:rPr>
+              <w:t>13,000</w:t>
             </w:r>
           </w:p>
         </w:tc>
@@ -20109,17 +20025,7 @@
                 <w:szCs w:val="18"/>
                 <w:lang w:val="sv-SE"/>
               </w:rPr>
-              <w:t>18</w:t>
-            </w:r>
-            <w:r>
-              <w:rPr>
-                <w:rFonts w:ascii="Times New Roman" w:hAnsi="Times New Roman" w:cs="Times New Roman"/>
-                <w:color w:val="000000"/>
-                <w:sz w:val="18"/>
-                <w:szCs w:val="18"/>
-                <w:lang w:val="sv-SE"/>
-              </w:rPr>
-              <w:t>,000</w:t>
+              <w:t>18,000</w:t>
             </w:r>
           </w:p>
         </w:tc>
@@ -20384,17 +20290,7 @@
                 <w:szCs w:val="18"/>
                 <w:lang w:val="sv-SE"/>
               </w:rPr>
-              <w:t>K</w:t>
-            </w:r>
-            <w:r>
-              <w:rPr>
-                <w:rFonts w:ascii="Times New Roman" w:hAnsi="Times New Roman" w:cs="Times New Roman"/>
-                <w:color w:val="000000"/>
-                <w:sz w:val="18"/>
-                <w:szCs w:val="18"/>
-                <w:lang w:val="sv-SE"/>
-              </w:rPr>
-              <w:t>entang</w:t>
+              <w:t>Kentang</w:t>
             </w:r>
           </w:p>
         </w:tc>
@@ -20510,66 +20406,36 @@
                 <w:szCs w:val="18"/>
                 <w:lang w:val="sv-SE"/>
               </w:rPr>
-              <w:t>1</w:t>
-            </w:r>
-            <w:r>
-              <w:rPr>
-                <w:rFonts w:ascii="Times New Roman" w:hAnsi="Times New Roman" w:cs="Times New Roman"/>
-                <w:color w:val="000000"/>
-                <w:sz w:val="18"/>
-                <w:szCs w:val="18"/>
-                <w:lang w:val="sv-SE"/>
-              </w:rPr>
-              <w:t>7</w:t>
-            </w:r>
-            <w:r>
-              <w:rPr>
-                <w:rFonts w:ascii="Times New Roman" w:hAnsi="Times New Roman" w:cs="Times New Roman"/>
-                <w:color w:val="000000"/>
-                <w:sz w:val="18"/>
-                <w:szCs w:val="18"/>
-                <w:lang w:val="sv-SE"/>
-              </w:rPr>
-              <w:t>.0</w:t>
-            </w:r>
-          </w:p>
-        </w:tc>
-        <w:tc>
-          <w:tcPr>
-            <w:tcW w:w="1335" w:type="dxa"/>
-          </w:tcPr>
-          <w:p>
-            <w:pPr>
-              <w:autoSpaceDE w:val="0"/>
-              <w:spacing w:after="0" w:line="240" w:lineRule="auto"/>
-              <w:jc w:val="center"/>
-              <w:rPr>
-                <w:rFonts w:ascii="Times New Roman" w:hAnsi="Times New Roman" w:cs="Times New Roman"/>
-                <w:color w:val="000000"/>
-                <w:sz w:val="18"/>
-                <w:szCs w:val="18"/>
-                <w:lang w:val="sv-SE"/>
-              </w:rPr>
-            </w:pPr>
-            <w:r>
-              <w:rPr>
-                <w:rFonts w:ascii="Times New Roman" w:hAnsi="Times New Roman" w:cs="Times New Roman"/>
-                <w:color w:val="000000"/>
-                <w:sz w:val="18"/>
-                <w:szCs w:val="18"/>
-                <w:lang w:val="sv-SE"/>
-              </w:rPr>
-              <w:t>10</w:t>
-            </w:r>
-            <w:r>
-              <w:rPr>
-                <w:rFonts w:ascii="Times New Roman" w:hAnsi="Times New Roman" w:cs="Times New Roman"/>
-                <w:color w:val="000000"/>
-                <w:sz w:val="18"/>
-                <w:szCs w:val="18"/>
-                <w:lang w:val="sv-SE"/>
-              </w:rPr>
-              <w:t>,000</w:t>
+              <w:t>17.0</w:t>
+            </w:r>
+          </w:p>
+        </w:tc>
+        <w:tc>
+          <w:tcPr>
+            <w:tcW w:w="1335" w:type="dxa"/>
+          </w:tcPr>
+          <w:p>
+            <w:pPr>
+              <w:autoSpaceDE w:val="0"/>
+              <w:spacing w:after="0" w:line="240" w:lineRule="auto"/>
+              <w:jc w:val="center"/>
+              <w:rPr>
+                <w:rFonts w:ascii="Times New Roman" w:hAnsi="Times New Roman" w:cs="Times New Roman"/>
+                <w:color w:val="000000"/>
+                <w:sz w:val="18"/>
+                <w:szCs w:val="18"/>
+                <w:lang w:val="sv-SE"/>
+              </w:rPr>
+            </w:pPr>
+            <w:r>
+              <w:rPr>
+                <w:rFonts w:ascii="Times New Roman" w:hAnsi="Times New Roman" w:cs="Times New Roman"/>
+                <w:color w:val="000000"/>
+                <w:sz w:val="18"/>
+                <w:szCs w:val="18"/>
+                <w:lang w:val="sv-SE"/>
+              </w:rPr>
+              <w:t>10,000</w:t>
             </w:r>
           </w:p>
         </w:tc>
@@ -20774,17 +20640,7 @@
                 <w:szCs w:val="18"/>
                 <w:lang w:val="sv-SE"/>
               </w:rPr>
-              <w:t>6</w:t>
-            </w:r>
-            <w:r>
-              <w:rPr>
-                <w:rFonts w:ascii="Times New Roman" w:hAnsi="Times New Roman" w:cs="Times New Roman"/>
-                <w:color w:val="000000"/>
-                <w:sz w:val="18"/>
-                <w:szCs w:val="18"/>
-                <w:lang w:val="sv-SE"/>
-              </w:rPr>
-              <w:t>,000</w:t>
+              <w:t>6,000</w:t>
             </w:r>
           </w:p>
         </w:tc>
@@ -20989,17 +20845,7 @@
                 <w:szCs w:val="18"/>
                 <w:lang w:val="sv-SE"/>
               </w:rPr>
-              <w:t>8</w:t>
-            </w:r>
-            <w:r>
-              <w:rPr>
-                <w:rFonts w:ascii="Times New Roman" w:hAnsi="Times New Roman" w:cs="Times New Roman"/>
-                <w:color w:val="000000"/>
-                <w:sz w:val="18"/>
-                <w:szCs w:val="18"/>
-                <w:lang w:val="sv-SE"/>
-              </w:rPr>
-              <w:t>,000</w:t>
+              <w:t>8,000</w:t>
             </w:r>
           </w:p>
         </w:tc>
@@ -21204,17 +21050,7 @@
                 <w:szCs w:val="18"/>
                 <w:lang w:val="sv-SE"/>
               </w:rPr>
-              <w:t>9</w:t>
-            </w:r>
-            <w:r>
-              <w:rPr>
-                <w:rFonts w:ascii="Times New Roman" w:hAnsi="Times New Roman" w:cs="Times New Roman"/>
-                <w:color w:val="000000"/>
-                <w:sz w:val="18"/>
-                <w:szCs w:val="18"/>
-                <w:lang w:val="sv-SE"/>
-              </w:rPr>
-              <w:t>,000</w:t>
+              <w:t>9,000</w:t>
             </w:r>
           </w:p>
         </w:tc>
@@ -21419,17 +21255,7 @@
                 <w:szCs w:val="18"/>
                 <w:lang w:val="sv-SE"/>
               </w:rPr>
-              <w:t>22</w:t>
-            </w:r>
-            <w:r>
-              <w:rPr>
-                <w:rFonts w:ascii="Times New Roman" w:hAnsi="Times New Roman" w:cs="Times New Roman"/>
-                <w:color w:val="000000"/>
-                <w:sz w:val="18"/>
-                <w:szCs w:val="18"/>
-                <w:lang w:val="sv-SE"/>
-              </w:rPr>
-              <w:t>,000</w:t>
+              <w:t>22,000</w:t>
             </w:r>
           </w:p>
         </w:tc>
@@ -21576,17 +21402,7 @@
                 <w:szCs w:val="18"/>
                 <w:lang w:val="sv-SE"/>
               </w:rPr>
-              <w:t>2</w:t>
-            </w:r>
-            <w:r>
-              <w:rPr>
-                <w:rFonts w:ascii="Times New Roman" w:hAnsi="Times New Roman" w:cs="Times New Roman"/>
-                <w:color w:val="000000"/>
-                <w:sz w:val="18"/>
-                <w:szCs w:val="18"/>
-                <w:lang w:val="sv-SE"/>
-              </w:rPr>
-              <w:t>.4</w:t>
+              <w:t>2.4</w:t>
             </w:r>
           </w:p>
         </w:tc>
@@ -21849,17 +21665,7 @@
                 <w:szCs w:val="18"/>
                 <w:lang w:val="sv-SE"/>
               </w:rPr>
-              <w:t>25</w:t>
-            </w:r>
-            <w:r>
-              <w:rPr>
-                <w:rFonts w:ascii="Times New Roman" w:hAnsi="Times New Roman" w:cs="Times New Roman"/>
-                <w:color w:val="000000"/>
-                <w:sz w:val="18"/>
-                <w:szCs w:val="18"/>
-                <w:lang w:val="sv-SE"/>
-              </w:rPr>
-              <w:t>,000</w:t>
+              <w:t>25,000</w:t>
             </w:r>
           </w:p>
         </w:tc>
@@ -22122,17 +21928,7 @@
                 <w:szCs w:val="18"/>
                 <w:lang w:val="sv-SE"/>
               </w:rPr>
-              <w:t>1</w:t>
-            </w:r>
-            <w:r>
-              <w:rPr>
-                <w:rFonts w:ascii="Times New Roman" w:hAnsi="Times New Roman" w:cs="Times New Roman"/>
-                <w:color w:val="000000"/>
-                <w:sz w:val="18"/>
-                <w:szCs w:val="18"/>
-                <w:lang w:val="sv-SE"/>
-              </w:rPr>
-              <w:t>65</w:t>
+              <w:t>165</w:t>
             </w:r>
           </w:p>
         </w:tc>
@@ -22190,17 +21986,7 @@
                 <w:szCs w:val="18"/>
                 <w:lang w:val="sv-SE"/>
               </w:rPr>
-              <w:t>0.</w:t>
-            </w:r>
-            <w:r>
-              <w:rPr>
-                <w:rFonts w:ascii="Times New Roman" w:hAnsi="Times New Roman" w:cs="Times New Roman"/>
-                <w:color w:val="000000"/>
-                <w:sz w:val="18"/>
-                <w:szCs w:val="18"/>
-                <w:lang w:val="sv-SE"/>
-              </w:rPr>
-              <w:t>0</w:t>
+              <w:t>0.0</w:t>
             </w:r>
           </w:p>
         </w:tc>
@@ -22347,56 +22133,36 @@
                 <w:szCs w:val="18"/>
                 <w:lang w:val="sv-SE"/>
               </w:rPr>
-              <w:t>15</w:t>
-            </w:r>
-            <w:r>
-              <w:rPr>
-                <w:rFonts w:ascii="Times New Roman" w:hAnsi="Times New Roman" w:cs="Times New Roman"/>
-                <w:color w:val="000000"/>
-                <w:sz w:val="18"/>
-                <w:szCs w:val="18"/>
-                <w:lang w:val="sv-SE"/>
-              </w:rPr>
-              <w:t>5</w:t>
-            </w:r>
-          </w:p>
-        </w:tc>
-        <w:tc>
-          <w:tcPr>
-            <w:tcW w:w="1335" w:type="dxa"/>
-          </w:tcPr>
-          <w:p>
-            <w:pPr>
-              <w:autoSpaceDE w:val="0"/>
-              <w:spacing w:after="0" w:line="240" w:lineRule="auto"/>
-              <w:jc w:val="center"/>
-              <w:rPr>
-                <w:rFonts w:ascii="Times New Roman" w:hAnsi="Times New Roman" w:cs="Times New Roman"/>
-                <w:color w:val="000000"/>
-                <w:sz w:val="18"/>
-                <w:szCs w:val="18"/>
-                <w:lang w:val="sv-SE"/>
-              </w:rPr>
-            </w:pPr>
-            <w:r>
-              <w:rPr>
-                <w:rFonts w:ascii="Times New Roman" w:hAnsi="Times New Roman" w:cs="Times New Roman"/>
-                <w:color w:val="000000"/>
-                <w:sz w:val="18"/>
-                <w:szCs w:val="18"/>
-                <w:lang w:val="sv-SE"/>
-              </w:rPr>
-              <w:t>13</w:t>
-            </w:r>
-            <w:r>
-              <w:rPr>
-                <w:rFonts w:ascii="Times New Roman" w:hAnsi="Times New Roman" w:cs="Times New Roman"/>
-                <w:color w:val="000000"/>
-                <w:sz w:val="18"/>
-                <w:szCs w:val="18"/>
-                <w:lang w:val="sv-SE"/>
-              </w:rPr>
-              <w:t>.0</w:t>
+              <w:t>155</w:t>
+            </w:r>
+          </w:p>
+        </w:tc>
+        <w:tc>
+          <w:tcPr>
+            <w:tcW w:w="1335" w:type="dxa"/>
+          </w:tcPr>
+          <w:p>
+            <w:pPr>
+              <w:autoSpaceDE w:val="0"/>
+              <w:spacing w:after="0" w:line="240" w:lineRule="auto"/>
+              <w:jc w:val="center"/>
+              <w:rPr>
+                <w:rFonts w:ascii="Times New Roman" w:hAnsi="Times New Roman" w:cs="Times New Roman"/>
+                <w:color w:val="000000"/>
+                <w:sz w:val="18"/>
+                <w:szCs w:val="18"/>
+                <w:lang w:val="sv-SE"/>
+              </w:rPr>
+            </w:pPr>
+            <w:r>
+              <w:rPr>
+                <w:rFonts w:ascii="Times New Roman" w:hAnsi="Times New Roman" w:cs="Times New Roman"/>
+                <w:color w:val="000000"/>
+                <w:sz w:val="18"/>
+                <w:szCs w:val="18"/>
+                <w:lang w:val="sv-SE"/>
+              </w:rPr>
+              <w:t>13.0</w:t>
             </w:r>
           </w:p>
         </w:tc>
@@ -22601,27 +22367,7 @@
                 <w:szCs w:val="18"/>
                 <w:lang w:val="sv-SE"/>
               </w:rPr>
-              <w:t>19</w:t>
-            </w:r>
-            <w:r>
-              <w:rPr>
-                <w:rFonts w:ascii="Times New Roman" w:hAnsi="Times New Roman" w:cs="Times New Roman"/>
-                <w:color w:val="000000"/>
-                <w:sz w:val="18"/>
-                <w:szCs w:val="18"/>
-                <w:lang w:val="sv-SE"/>
-              </w:rPr>
-              <w:t>.</w:t>
-            </w:r>
-            <w:r>
-              <w:rPr>
-                <w:rFonts w:ascii="Times New Roman" w:hAnsi="Times New Roman" w:cs="Times New Roman"/>
-                <w:color w:val="000000"/>
-                <w:sz w:val="18"/>
-                <w:szCs w:val="18"/>
-                <w:lang w:val="sv-SE"/>
-              </w:rPr>
-              <w:t>0</w:t>
+              <w:t>19.0</w:t>
             </w:r>
           </w:p>
         </w:tc>
@@ -22797,56 +22543,36 @@
                 <w:szCs w:val="18"/>
                 <w:lang w:val="sv-SE"/>
               </w:rPr>
-              <w:t>7</w:t>
-            </w:r>
-            <w:r>
-              <w:rPr>
-                <w:rFonts w:ascii="Times New Roman" w:hAnsi="Times New Roman" w:cs="Times New Roman"/>
-                <w:color w:val="000000"/>
-                <w:sz w:val="18"/>
-                <w:szCs w:val="18"/>
-                <w:lang w:val="sv-SE"/>
-              </w:rPr>
-              <w:t>6</w:t>
-            </w:r>
-          </w:p>
-        </w:tc>
-        <w:tc>
-          <w:tcPr>
-            <w:tcW w:w="1335" w:type="dxa"/>
-          </w:tcPr>
-          <w:p>
-            <w:pPr>
-              <w:autoSpaceDE w:val="0"/>
-              <w:spacing w:after="0" w:line="240" w:lineRule="auto"/>
-              <w:jc w:val="center"/>
-              <w:rPr>
-                <w:rFonts w:ascii="Times New Roman" w:hAnsi="Times New Roman" w:cs="Times New Roman"/>
-                <w:color w:val="000000"/>
-                <w:sz w:val="18"/>
-                <w:szCs w:val="18"/>
-                <w:lang w:val="sv-SE"/>
-              </w:rPr>
-            </w:pPr>
-            <w:r>
-              <w:rPr>
-                <w:rFonts w:ascii="Times New Roman" w:hAnsi="Times New Roman" w:cs="Times New Roman"/>
-                <w:color w:val="000000"/>
-                <w:sz w:val="18"/>
-                <w:szCs w:val="18"/>
-                <w:lang w:val="sv-SE"/>
-              </w:rPr>
-              <w:t>8</w:t>
-            </w:r>
-            <w:r>
-              <w:rPr>
-                <w:rFonts w:ascii="Times New Roman" w:hAnsi="Times New Roman" w:cs="Times New Roman"/>
-                <w:color w:val="000000"/>
-                <w:sz w:val="18"/>
-                <w:szCs w:val="18"/>
-                <w:lang w:val="sv-SE"/>
-              </w:rPr>
-              <w:t>.0</w:t>
+              <w:t>76</w:t>
+            </w:r>
+          </w:p>
+        </w:tc>
+        <w:tc>
+          <w:tcPr>
+            <w:tcW w:w="1335" w:type="dxa"/>
+          </w:tcPr>
+          <w:p>
+            <w:pPr>
+              <w:autoSpaceDE w:val="0"/>
+              <w:spacing w:after="0" w:line="240" w:lineRule="auto"/>
+              <w:jc w:val="center"/>
+              <w:rPr>
+                <w:rFonts w:ascii="Times New Roman" w:hAnsi="Times New Roman" w:cs="Times New Roman"/>
+                <w:color w:val="000000"/>
+                <w:sz w:val="18"/>
+                <w:szCs w:val="18"/>
+                <w:lang w:val="sv-SE"/>
+              </w:rPr>
+            </w:pPr>
+            <w:r>
+              <w:rPr>
+                <w:rFonts w:ascii="Times New Roman" w:hAnsi="Times New Roman" w:cs="Times New Roman"/>
+                <w:color w:val="000000"/>
+                <w:sz w:val="18"/>
+                <w:szCs w:val="18"/>
+                <w:lang w:val="sv-SE"/>
+              </w:rPr>
+              <w:t>8.0</w:t>
             </w:r>
           </w:p>
         </w:tc>
@@ -23022,17 +22748,7 @@
                 <w:szCs w:val="18"/>
                 <w:lang w:val="sv-SE"/>
               </w:rPr>
-              <w:t>16</w:t>
-            </w:r>
-            <w:r>
-              <w:rPr>
-                <w:rFonts w:ascii="Times New Roman" w:hAnsi="Times New Roman" w:cs="Times New Roman"/>
-                <w:color w:val="000000"/>
-                <w:sz w:val="18"/>
-                <w:szCs w:val="18"/>
-                <w:lang w:val="sv-SE"/>
-              </w:rPr>
-              <w:t>8</w:t>
+              <w:t>168</w:t>
             </w:r>
           </w:p>
         </w:tc>
@@ -23266,27 +22982,7 @@
                 <w:szCs w:val="18"/>
                 <w:lang w:val="sv-SE"/>
               </w:rPr>
-              <w:t>26</w:t>
-            </w:r>
-            <w:r>
-              <w:rPr>
-                <w:rFonts w:ascii="Times New Roman" w:hAnsi="Times New Roman" w:cs="Times New Roman"/>
-                <w:color w:val="000000"/>
-                <w:sz w:val="18"/>
-                <w:szCs w:val="18"/>
-                <w:lang w:val="sv-SE"/>
-              </w:rPr>
-              <w:t>.</w:t>
-            </w:r>
-            <w:r>
-              <w:rPr>
-                <w:rFonts w:ascii="Times New Roman" w:hAnsi="Times New Roman" w:cs="Times New Roman"/>
-                <w:color w:val="000000"/>
-                <w:sz w:val="18"/>
-                <w:szCs w:val="18"/>
-                <w:lang w:val="sv-SE"/>
-              </w:rPr>
-              <w:t>0</w:t>
+              <w:t>26.0</w:t>
             </w:r>
           </w:p>
         </w:tc>
@@ -23930,27 +23626,7 @@
                 <w:szCs w:val="18"/>
                 <w:lang w:val="sv-SE"/>
               </w:rPr>
-              <w:t>2</w:t>
-            </w:r>
-            <w:r>
-              <w:rPr>
-                <w:rFonts w:ascii="Times New Roman" w:hAnsi="Times New Roman" w:cs="Times New Roman"/>
-                <w:color w:val="000000"/>
-                <w:sz w:val="18"/>
-                <w:szCs w:val="18"/>
-                <w:lang w:val="sv-SE"/>
-              </w:rPr>
-              <w:t>3</w:t>
-            </w:r>
-            <w:r>
-              <w:rPr>
-                <w:rFonts w:ascii="Times New Roman" w:hAnsi="Times New Roman" w:cs="Times New Roman"/>
-                <w:color w:val="000000"/>
-                <w:sz w:val="18"/>
-                <w:szCs w:val="18"/>
-                <w:lang w:val="sv-SE"/>
-              </w:rPr>
-              <w:t>.0</w:t>
+              <w:t>23.0</w:t>
             </w:r>
           </w:p>
         </w:tc>
@@ -24039,17 +23715,7 @@
                 <w:szCs w:val="18"/>
                 <w:lang w:val="sv-SE"/>
               </w:rPr>
-              <w:t xml:space="preserve">Kacang </w:t>
-            </w:r>
-            <w:r>
-              <w:rPr>
-                <w:rFonts w:ascii="Times New Roman" w:hAnsi="Times New Roman" w:cs="Times New Roman"/>
-                <w:color w:val="000000"/>
-                <w:sz w:val="18"/>
-                <w:szCs w:val="18"/>
-                <w:lang w:val="sv-SE"/>
-              </w:rPr>
-              <w:t>Hijau</w:t>
+              <w:t>Kacang Hijau</w:t>
             </w:r>
           </w:p>
         </w:tc>
@@ -24107,56 +23773,36 @@
                 <w:szCs w:val="18"/>
                 <w:lang w:val="sv-SE"/>
               </w:rPr>
-              <w:t>3</w:t>
-            </w:r>
-            <w:r>
-              <w:rPr>
-                <w:rFonts w:ascii="Times New Roman" w:hAnsi="Times New Roman" w:cs="Times New Roman"/>
-                <w:color w:val="000000"/>
-                <w:sz w:val="18"/>
-                <w:szCs w:val="18"/>
-                <w:lang w:val="sv-SE"/>
-              </w:rPr>
-              <w:t>47</w:t>
-            </w:r>
-          </w:p>
-        </w:tc>
-        <w:tc>
-          <w:tcPr>
-            <w:tcW w:w="1335" w:type="dxa"/>
-          </w:tcPr>
-          <w:p>
-            <w:pPr>
-              <w:autoSpaceDE w:val="0"/>
-              <w:spacing w:after="0" w:line="240" w:lineRule="auto"/>
-              <w:jc w:val="center"/>
-              <w:rPr>
-                <w:rFonts w:ascii="Times New Roman" w:hAnsi="Times New Roman" w:cs="Times New Roman"/>
-                <w:color w:val="000000"/>
-                <w:sz w:val="18"/>
-                <w:szCs w:val="18"/>
-                <w:lang w:val="sv-SE"/>
-              </w:rPr>
-            </w:pPr>
-            <w:r>
-              <w:rPr>
-                <w:rFonts w:ascii="Times New Roman" w:hAnsi="Times New Roman" w:cs="Times New Roman"/>
-                <w:color w:val="000000"/>
-                <w:sz w:val="18"/>
-                <w:szCs w:val="18"/>
-                <w:lang w:val="sv-SE"/>
-              </w:rPr>
-              <w:t>24</w:t>
-            </w:r>
-            <w:r>
-              <w:rPr>
-                <w:rFonts w:ascii="Times New Roman" w:hAnsi="Times New Roman" w:cs="Times New Roman"/>
-                <w:color w:val="000000"/>
-                <w:sz w:val="18"/>
-                <w:szCs w:val="18"/>
-                <w:lang w:val="sv-SE"/>
-              </w:rPr>
-              <w:t>.0</w:t>
+              <w:t>347</w:t>
+            </w:r>
+          </w:p>
+        </w:tc>
+        <w:tc>
+          <w:tcPr>
+            <w:tcW w:w="1335" w:type="dxa"/>
+          </w:tcPr>
+          <w:p>
+            <w:pPr>
+              <w:autoSpaceDE w:val="0"/>
+              <w:spacing w:after="0" w:line="240" w:lineRule="auto"/>
+              <w:jc w:val="center"/>
+              <w:rPr>
+                <w:rFonts w:ascii="Times New Roman" w:hAnsi="Times New Roman" w:cs="Times New Roman"/>
+                <w:color w:val="000000"/>
+                <w:sz w:val="18"/>
+                <w:szCs w:val="18"/>
+                <w:lang w:val="sv-SE"/>
+              </w:rPr>
+            </w:pPr>
+            <w:r>
+              <w:rPr>
+                <w:rFonts w:ascii="Times New Roman" w:hAnsi="Times New Roman" w:cs="Times New Roman"/>
+                <w:color w:val="000000"/>
+                <w:sz w:val="18"/>
+                <w:szCs w:val="18"/>
+                <w:lang w:val="sv-SE"/>
+              </w:rPr>
+              <w:t>24.0</w:t>
             </w:r>
           </w:p>
         </w:tc>
@@ -24564,17 +24210,7 @@
                 <w:szCs w:val="18"/>
                 <w:lang w:val="sv-SE"/>
               </w:rPr>
-              <w:t>7</w:t>
-            </w:r>
-            <w:r>
-              <w:rPr>
-                <w:rFonts w:ascii="Times New Roman" w:hAnsi="Times New Roman" w:cs="Times New Roman"/>
-                <w:color w:val="000000"/>
-                <w:sz w:val="18"/>
-                <w:szCs w:val="18"/>
-                <w:lang w:val="sv-SE"/>
-              </w:rPr>
-              <w:t>,000</w:t>
+              <w:t>7,000</w:t>
             </w:r>
           </w:p>
         </w:tc>
@@ -24721,105 +24357,65 @@
                 <w:szCs w:val="18"/>
                 <w:lang w:val="sv-SE"/>
               </w:rPr>
-              <w:t>3</w:t>
-            </w:r>
-            <w:r>
-              <w:rPr>
-                <w:rFonts w:ascii="Times New Roman" w:hAnsi="Times New Roman" w:cs="Times New Roman"/>
-                <w:color w:val="000000"/>
-                <w:sz w:val="18"/>
-                <w:szCs w:val="18"/>
-                <w:lang w:val="sv-SE"/>
-              </w:rPr>
-              <w:t>.</w:t>
-            </w:r>
-            <w:r>
-              <w:rPr>
-                <w:rFonts w:ascii="Times New Roman" w:hAnsi="Times New Roman" w:cs="Times New Roman"/>
-                <w:color w:val="000000"/>
-                <w:sz w:val="18"/>
-                <w:szCs w:val="18"/>
-                <w:lang w:val="sv-SE"/>
-              </w:rPr>
-              <w:t>0</w:t>
-            </w:r>
-          </w:p>
-        </w:tc>
-        <w:tc>
-          <w:tcPr>
-            <w:tcW w:w="1335" w:type="dxa"/>
-          </w:tcPr>
-          <w:p>
-            <w:pPr>
-              <w:autoSpaceDE w:val="0"/>
-              <w:spacing w:after="0" w:line="240" w:lineRule="auto"/>
-              <w:jc w:val="center"/>
-              <w:rPr>
-                <w:rFonts w:ascii="Times New Roman" w:hAnsi="Times New Roman" w:cs="Times New Roman"/>
-                <w:color w:val="000000"/>
-                <w:sz w:val="18"/>
-                <w:szCs w:val="18"/>
-                <w:lang w:val="sv-SE"/>
-              </w:rPr>
-            </w:pPr>
-            <w:r>
-              <w:rPr>
-                <w:rFonts w:ascii="Times New Roman" w:hAnsi="Times New Roman" w:cs="Times New Roman"/>
-                <w:color w:val="000000"/>
-                <w:sz w:val="18"/>
-                <w:szCs w:val="18"/>
-                <w:lang w:val="sv-SE"/>
-              </w:rPr>
-              <w:t>3.</w:t>
-            </w:r>
-            <w:r>
-              <w:rPr>
-                <w:rFonts w:ascii="Times New Roman" w:hAnsi="Times New Roman" w:cs="Times New Roman"/>
-                <w:color w:val="000000"/>
-                <w:sz w:val="18"/>
-                <w:szCs w:val="18"/>
-                <w:lang w:val="sv-SE"/>
-              </w:rPr>
-              <w:t>0</w:t>
-            </w:r>
-          </w:p>
-        </w:tc>
-        <w:tc>
-          <w:tcPr>
-            <w:tcW w:w="1335" w:type="dxa"/>
-          </w:tcPr>
-          <w:p>
-            <w:pPr>
-              <w:autoSpaceDE w:val="0"/>
-              <w:spacing w:after="0" w:line="240" w:lineRule="auto"/>
-              <w:jc w:val="center"/>
-              <w:rPr>
-                <w:rFonts w:ascii="Times New Roman" w:hAnsi="Times New Roman" w:cs="Times New Roman"/>
-                <w:color w:val="000000"/>
-                <w:sz w:val="18"/>
-                <w:szCs w:val="18"/>
-                <w:lang w:val="sv-SE"/>
-              </w:rPr>
-            </w:pPr>
-            <w:r>
-              <w:rPr>
-                <w:rFonts w:ascii="Times New Roman" w:hAnsi="Times New Roman" w:cs="Times New Roman"/>
-                <w:color w:val="000000"/>
-                <w:sz w:val="18"/>
-                <w:szCs w:val="18"/>
-                <w:lang w:val="sv-SE"/>
-              </w:rPr>
-              <w:t>6</w:t>
-            </w:r>
-            <w:r>
-              <w:rPr>
-                <w:rFonts w:ascii="Times New Roman" w:hAnsi="Times New Roman" w:cs="Times New Roman"/>
-                <w:color w:val="000000"/>
-                <w:sz w:val="18"/>
-                <w:szCs w:val="18"/>
-                <w:lang w:val="sv-SE"/>
-              </w:rPr>
-              <w:t>,000</w:t>
+              <w:t>3.0</w:t>
+            </w:r>
+          </w:p>
+        </w:tc>
+        <w:tc>
+          <w:tcPr>
+            <w:tcW w:w="1335" w:type="dxa"/>
+          </w:tcPr>
+          <w:p>
+            <w:pPr>
+              <w:autoSpaceDE w:val="0"/>
+              <w:spacing w:after="0" w:line="240" w:lineRule="auto"/>
+              <w:jc w:val="center"/>
+              <w:rPr>
+                <w:rFonts w:ascii="Times New Roman" w:hAnsi="Times New Roman" w:cs="Times New Roman"/>
+                <w:color w:val="000000"/>
+                <w:sz w:val="18"/>
+                <w:szCs w:val="18"/>
+                <w:lang w:val="sv-SE"/>
+              </w:rPr>
+            </w:pPr>
+            <w:r>
+              <w:rPr>
+                <w:rFonts w:ascii="Times New Roman" w:hAnsi="Times New Roman" w:cs="Times New Roman"/>
+                <w:color w:val="000000"/>
+                <w:sz w:val="18"/>
+                <w:szCs w:val="18"/>
+                <w:lang w:val="sv-SE"/>
+              </w:rPr>
+              <w:t>3.0</w:t>
+            </w:r>
+          </w:p>
+        </w:tc>
+        <w:tc>
+          <w:tcPr>
+            <w:tcW w:w="1335" w:type="dxa"/>
+          </w:tcPr>
+          <w:p>
+            <w:pPr>
+              <w:autoSpaceDE w:val="0"/>
+              <w:spacing w:after="0" w:line="240" w:lineRule="auto"/>
+              <w:jc w:val="center"/>
+              <w:rPr>
+                <w:rFonts w:ascii="Times New Roman" w:hAnsi="Times New Roman" w:cs="Times New Roman"/>
+                <w:color w:val="000000"/>
+                <w:sz w:val="18"/>
+                <w:szCs w:val="18"/>
+                <w:lang w:val="sv-SE"/>
+              </w:rPr>
+            </w:pPr>
+            <w:r>
+              <w:rPr>
+                <w:rFonts w:ascii="Times New Roman" w:hAnsi="Times New Roman" w:cs="Times New Roman"/>
+                <w:color w:val="000000"/>
+                <w:sz w:val="18"/>
+                <w:szCs w:val="18"/>
+                <w:lang w:val="sv-SE"/>
+              </w:rPr>
+              <w:t>6,000</w:t>
             </w:r>
           </w:p>
         </w:tc>
@@ -24966,56 +24562,36 @@
                 <w:szCs w:val="18"/>
                 <w:lang w:val="sv-SE"/>
               </w:rPr>
-              <w:t>0.</w:t>
-            </w:r>
-            <w:r>
-              <w:rPr>
-                <w:rFonts w:ascii="Times New Roman" w:hAnsi="Times New Roman" w:cs="Times New Roman"/>
-                <w:color w:val="000000"/>
-                <w:sz w:val="18"/>
-                <w:szCs w:val="18"/>
-                <w:lang w:val="sv-SE"/>
-              </w:rPr>
-              <w:t>9</w:t>
-            </w:r>
-          </w:p>
-        </w:tc>
-        <w:tc>
-          <w:tcPr>
-            <w:tcW w:w="1335" w:type="dxa"/>
-          </w:tcPr>
-          <w:p>
-            <w:pPr>
-              <w:autoSpaceDE w:val="0"/>
-              <w:spacing w:after="0" w:line="240" w:lineRule="auto"/>
-              <w:jc w:val="center"/>
-              <w:rPr>
-                <w:rFonts w:ascii="Times New Roman" w:hAnsi="Times New Roman" w:cs="Times New Roman"/>
-                <w:color w:val="000000"/>
-                <w:sz w:val="18"/>
-                <w:szCs w:val="18"/>
-                <w:lang w:val="sv-SE"/>
-              </w:rPr>
-            </w:pPr>
-            <w:r>
-              <w:rPr>
-                <w:rFonts w:ascii="Times New Roman" w:hAnsi="Times New Roman" w:cs="Times New Roman"/>
-                <w:color w:val="000000"/>
-                <w:sz w:val="18"/>
-                <w:szCs w:val="18"/>
-                <w:lang w:val="sv-SE"/>
-              </w:rPr>
-              <w:t>10</w:t>
-            </w:r>
-            <w:r>
-              <w:rPr>
-                <w:rFonts w:ascii="Times New Roman" w:hAnsi="Times New Roman" w:cs="Times New Roman"/>
-                <w:color w:val="000000"/>
-                <w:sz w:val="18"/>
-                <w:szCs w:val="18"/>
-                <w:lang w:val="sv-SE"/>
-              </w:rPr>
-              <w:t>.0</w:t>
+              <w:t>0.9</w:t>
+            </w:r>
+          </w:p>
+        </w:tc>
+        <w:tc>
+          <w:tcPr>
+            <w:tcW w:w="1335" w:type="dxa"/>
+          </w:tcPr>
+          <w:p>
+            <w:pPr>
+              <w:autoSpaceDE w:val="0"/>
+              <w:spacing w:after="0" w:line="240" w:lineRule="auto"/>
+              <w:jc w:val="center"/>
+              <w:rPr>
+                <w:rFonts w:ascii="Times New Roman" w:hAnsi="Times New Roman" w:cs="Times New Roman"/>
+                <w:color w:val="000000"/>
+                <w:sz w:val="18"/>
+                <w:szCs w:val="18"/>
+                <w:lang w:val="sv-SE"/>
+              </w:rPr>
+            </w:pPr>
+            <w:r>
+              <w:rPr>
+                <w:rFonts w:ascii="Times New Roman" w:hAnsi="Times New Roman" w:cs="Times New Roman"/>
+                <w:color w:val="000000"/>
+                <w:sz w:val="18"/>
+                <w:szCs w:val="18"/>
+                <w:lang w:val="sv-SE"/>
+              </w:rPr>
+              <w:t>10.0</w:t>
             </w:r>
           </w:p>
         </w:tc>
@@ -25191,17 +24767,7 @@
                 <w:szCs w:val="18"/>
                 <w:lang w:val="sv-SE"/>
               </w:rPr>
-              <w:t>2.</w:t>
-            </w:r>
-            <w:r>
-              <w:rPr>
-                <w:rFonts w:ascii="Times New Roman" w:hAnsi="Times New Roman" w:cs="Times New Roman"/>
-                <w:color w:val="000000"/>
-                <w:sz w:val="18"/>
-                <w:szCs w:val="18"/>
-                <w:lang w:val="sv-SE"/>
-              </w:rPr>
-              <w:t>8</w:t>
+              <w:t>2.8</w:t>
             </w:r>
           </w:p>
         </w:tc>
@@ -25259,17 +24825,7 @@
                 <w:szCs w:val="18"/>
                 <w:lang w:val="sv-SE"/>
               </w:rPr>
-              <w:t>1</w:t>
-            </w:r>
-            <w:r>
-              <w:rPr>
-                <w:rFonts w:ascii="Times New Roman" w:hAnsi="Times New Roman" w:cs="Times New Roman"/>
-                <w:color w:val="000000"/>
-                <w:sz w:val="18"/>
-                <w:szCs w:val="18"/>
-                <w:lang w:val="sv-SE"/>
-              </w:rPr>
-              <w:t>8,000</w:t>
+              <w:t>18,000</w:t>
             </w:r>
           </w:p>
         </w:tc>
@@ -25445,17 +25001,7 @@
                 <w:szCs w:val="18"/>
                 <w:lang w:val="sv-SE"/>
               </w:rPr>
-              <w:t>6</w:t>
-            </w:r>
-            <w:r>
-              <w:rPr>
-                <w:rFonts w:ascii="Times New Roman" w:hAnsi="Times New Roman" w:cs="Times New Roman"/>
-                <w:color w:val="000000"/>
-                <w:sz w:val="18"/>
-                <w:szCs w:val="18"/>
-                <w:lang w:val="sv-SE"/>
-              </w:rPr>
-              <w:t>.0</w:t>
+              <w:t>6.0</w:t>
             </w:r>
           </w:p>
         </w:tc>
@@ -25914,17 +25460,7 @@
                 <w:szCs w:val="18"/>
                 <w:lang w:val="sv-SE"/>
               </w:rPr>
-              <w:t>7</w:t>
-            </w:r>
-            <w:r>
-              <w:rPr>
-                <w:rFonts w:ascii="Times New Roman" w:hAnsi="Times New Roman" w:cs="Times New Roman"/>
-                <w:color w:val="000000"/>
-                <w:sz w:val="18"/>
-                <w:szCs w:val="18"/>
-                <w:lang w:val="sv-SE"/>
-              </w:rPr>
-              <w:t>,000</w:t>
+              <w:t>7,000</w:t>
             </w:r>
           </w:p>
         </w:tc>
@@ -26911,17 +26447,7 @@
                 <w:szCs w:val="18"/>
                 <w:lang w:val="sv-SE"/>
               </w:rPr>
-              <w:t>3.</w:t>
-            </w:r>
-            <w:r>
-              <w:rPr>
-                <w:rFonts w:ascii="Times New Roman" w:hAnsi="Times New Roman" w:cs="Times New Roman"/>
-                <w:color w:val="000000"/>
-                <w:sz w:val="18"/>
-                <w:szCs w:val="18"/>
-                <w:lang w:val="sv-SE"/>
-              </w:rPr>
-              <w:t>2</w:t>
+              <w:t>3.2</w:t>
             </w:r>
           </w:p>
         </w:tc>
@@ -26979,27 +26505,7 @@
                 <w:szCs w:val="18"/>
                 <w:lang w:val="sv-SE"/>
               </w:rPr>
-              <w:t>2</w:t>
-            </w:r>
-            <w:r>
-              <w:rPr>
-                <w:rFonts w:ascii="Times New Roman" w:hAnsi="Times New Roman" w:cs="Times New Roman"/>
-                <w:color w:val="000000"/>
-                <w:sz w:val="18"/>
-                <w:szCs w:val="18"/>
-                <w:lang w:val="sv-SE"/>
-              </w:rPr>
-              <w:t>0</w:t>
-            </w:r>
-            <w:r>
-              <w:rPr>
-                <w:rFonts w:ascii="Times New Roman" w:hAnsi="Times New Roman" w:cs="Times New Roman"/>
-                <w:color w:val="000000"/>
-                <w:sz w:val="18"/>
-                <w:szCs w:val="18"/>
-                <w:lang w:val="sv-SE"/>
-              </w:rPr>
-              <w:t>,000</w:t>
+              <w:t>20,000</w:t>
             </w:r>
           </w:p>
         </w:tc>
@@ -27146,56 +26652,36 @@
                 <w:szCs w:val="18"/>
                 <w:lang w:val="sv-SE"/>
               </w:rPr>
-              <w:t>0</w:t>
-            </w:r>
-            <w:r>
-              <w:rPr>
-                <w:rFonts w:ascii="Times New Roman" w:hAnsi="Times New Roman" w:cs="Times New Roman"/>
-                <w:color w:val="000000"/>
-                <w:sz w:val="18"/>
-                <w:szCs w:val="18"/>
-                <w:lang w:val="sv-SE"/>
-              </w:rPr>
-              <w:t>.0</w:t>
-            </w:r>
-          </w:p>
-        </w:tc>
-        <w:tc>
-          <w:tcPr>
-            <w:tcW w:w="1335" w:type="dxa"/>
-          </w:tcPr>
-          <w:p>
-            <w:pPr>
-              <w:autoSpaceDE w:val="0"/>
-              <w:spacing w:after="0" w:line="240" w:lineRule="auto"/>
-              <w:jc w:val="center"/>
-              <w:rPr>
-                <w:rFonts w:ascii="Times New Roman" w:hAnsi="Times New Roman" w:cs="Times New Roman"/>
-                <w:color w:val="000000"/>
-                <w:sz w:val="18"/>
-                <w:szCs w:val="18"/>
-                <w:lang w:val="sv-SE"/>
-              </w:rPr>
-            </w:pPr>
-            <w:r>
-              <w:rPr>
-                <w:rFonts w:ascii="Times New Roman" w:hAnsi="Times New Roman" w:cs="Times New Roman"/>
-                <w:color w:val="000000"/>
-                <w:sz w:val="18"/>
-                <w:szCs w:val="18"/>
-                <w:lang w:val="sv-SE"/>
-              </w:rPr>
-              <w:t>8</w:t>
-            </w:r>
-            <w:r>
-              <w:rPr>
-                <w:rFonts w:ascii="Times New Roman" w:hAnsi="Times New Roman" w:cs="Times New Roman"/>
-                <w:color w:val="000000"/>
-                <w:sz w:val="18"/>
-                <w:szCs w:val="18"/>
-                <w:lang w:val="sv-SE"/>
-              </w:rPr>
-              <w:t>.0</w:t>
+              <w:t>0.0</w:t>
+            </w:r>
+          </w:p>
+        </w:tc>
+        <w:tc>
+          <w:tcPr>
+            <w:tcW w:w="1335" w:type="dxa"/>
+          </w:tcPr>
+          <w:p>
+            <w:pPr>
+              <w:autoSpaceDE w:val="0"/>
+              <w:spacing w:after="0" w:line="240" w:lineRule="auto"/>
+              <w:jc w:val="center"/>
+              <w:rPr>
+                <w:rFonts w:ascii="Times New Roman" w:hAnsi="Times New Roman" w:cs="Times New Roman"/>
+                <w:color w:val="000000"/>
+                <w:sz w:val="18"/>
+                <w:szCs w:val="18"/>
+                <w:lang w:val="sv-SE"/>
+              </w:rPr>
+            </w:pPr>
+            <w:r>
+              <w:rPr>
+                <w:rFonts w:ascii="Times New Roman" w:hAnsi="Times New Roman" w:cs="Times New Roman"/>
+                <w:color w:val="000000"/>
+                <w:sz w:val="18"/>
+                <w:szCs w:val="18"/>
+                <w:lang w:val="sv-SE"/>
+              </w:rPr>
+              <w:t>8.0</w:t>
             </w:r>
           </w:p>
         </w:tc>
@@ -27342,56 +26828,36 @@
                 <w:szCs w:val="18"/>
                 <w:lang w:val="sv-SE"/>
               </w:rPr>
-              <w:t>4</w:t>
-            </w:r>
-            <w:r>
-              <w:rPr>
-                <w:rFonts w:ascii="Times New Roman" w:hAnsi="Times New Roman" w:cs="Times New Roman"/>
-                <w:color w:val="000000"/>
-                <w:sz w:val="18"/>
-                <w:szCs w:val="18"/>
-                <w:lang w:val="sv-SE"/>
-              </w:rPr>
-              <w:t>5</w:t>
-            </w:r>
-          </w:p>
-        </w:tc>
-        <w:tc>
-          <w:tcPr>
-            <w:tcW w:w="1335" w:type="dxa"/>
-          </w:tcPr>
-          <w:p>
-            <w:pPr>
-              <w:autoSpaceDE w:val="0"/>
-              <w:spacing w:after="0" w:line="240" w:lineRule="auto"/>
-              <w:jc w:val="center"/>
-              <w:rPr>
-                <w:rFonts w:ascii="Times New Roman" w:hAnsi="Times New Roman" w:cs="Times New Roman"/>
-                <w:color w:val="000000"/>
-                <w:sz w:val="18"/>
-                <w:szCs w:val="18"/>
-                <w:lang w:val="sv-SE"/>
-              </w:rPr>
-            </w:pPr>
-            <w:r>
-              <w:rPr>
-                <w:rFonts w:ascii="Times New Roman" w:hAnsi="Times New Roman" w:cs="Times New Roman"/>
-                <w:color w:val="000000"/>
-                <w:sz w:val="18"/>
-                <w:szCs w:val="18"/>
-                <w:lang w:val="sv-SE"/>
-              </w:rPr>
-              <w:t>0.</w:t>
-            </w:r>
-            <w:r>
-              <w:rPr>
-                <w:rFonts w:ascii="Times New Roman" w:hAnsi="Times New Roman" w:cs="Times New Roman"/>
-                <w:color w:val="000000"/>
-                <w:sz w:val="18"/>
-                <w:szCs w:val="18"/>
-                <w:lang w:val="sv-SE"/>
-              </w:rPr>
-              <w:t>7</w:t>
+              <w:t>45</w:t>
+            </w:r>
+          </w:p>
+        </w:tc>
+        <w:tc>
+          <w:tcPr>
+            <w:tcW w:w="1335" w:type="dxa"/>
+          </w:tcPr>
+          <w:p>
+            <w:pPr>
+              <w:autoSpaceDE w:val="0"/>
+              <w:spacing w:after="0" w:line="240" w:lineRule="auto"/>
+              <w:jc w:val="center"/>
+              <w:rPr>
+                <w:rFonts w:ascii="Times New Roman" w:hAnsi="Times New Roman" w:cs="Times New Roman"/>
+                <w:color w:val="000000"/>
+                <w:sz w:val="18"/>
+                <w:szCs w:val="18"/>
+                <w:lang w:val="sv-SE"/>
+              </w:rPr>
+            </w:pPr>
+            <w:r>
+              <w:rPr>
+                <w:rFonts w:ascii="Times New Roman" w:hAnsi="Times New Roman" w:cs="Times New Roman"/>
+                <w:color w:val="000000"/>
+                <w:sz w:val="18"/>
+                <w:szCs w:val="18"/>
+                <w:lang w:val="sv-SE"/>
+              </w:rPr>
+              <w:t>0.7</w:t>
             </w:r>
           </w:p>
         </w:tc>
@@ -27449,17 +26915,7 @@
                 <w:szCs w:val="18"/>
                 <w:lang w:val="sv-SE"/>
               </w:rPr>
-              <w:t>8</w:t>
-            </w:r>
-            <w:r>
-              <w:rPr>
-                <w:rFonts w:ascii="Times New Roman" w:hAnsi="Times New Roman" w:cs="Times New Roman"/>
-                <w:color w:val="000000"/>
-                <w:sz w:val="18"/>
-                <w:szCs w:val="18"/>
-                <w:lang w:val="sv-SE"/>
-              </w:rPr>
-              <w:t>,000</w:t>
+              <w:t>8,000</w:t>
             </w:r>
           </w:p>
         </w:tc>
@@ -27606,95 +27062,65 @@
                 <w:szCs w:val="18"/>
                 <w:lang w:val="sv-SE"/>
               </w:rPr>
-              <w:t>0.</w:t>
-            </w:r>
-            <w:r>
-              <w:rPr>
-                <w:rFonts w:ascii="Times New Roman" w:hAnsi="Times New Roman" w:cs="Times New Roman"/>
-                <w:color w:val="000000"/>
-                <w:sz w:val="18"/>
-                <w:szCs w:val="18"/>
-                <w:lang w:val="sv-SE"/>
-              </w:rPr>
-              <w:t>7</w:t>
-            </w:r>
-          </w:p>
-        </w:tc>
-        <w:tc>
-          <w:tcPr>
-            <w:tcW w:w="1335" w:type="dxa"/>
-          </w:tcPr>
-          <w:p>
-            <w:pPr>
-              <w:autoSpaceDE w:val="0"/>
-              <w:spacing w:after="0" w:line="240" w:lineRule="auto"/>
-              <w:jc w:val="center"/>
-              <w:rPr>
-                <w:rFonts w:ascii="Times New Roman" w:hAnsi="Times New Roman" w:cs="Times New Roman"/>
-                <w:color w:val="000000"/>
-                <w:sz w:val="18"/>
-                <w:szCs w:val="18"/>
-                <w:lang w:val="sv-SE"/>
-              </w:rPr>
-            </w:pPr>
-            <w:r>
-              <w:rPr>
-                <w:rFonts w:ascii="Times New Roman" w:hAnsi="Times New Roman" w:cs="Times New Roman"/>
-                <w:color w:val="000000"/>
-                <w:sz w:val="18"/>
-                <w:szCs w:val="18"/>
-                <w:lang w:val="sv-SE"/>
-              </w:rPr>
-              <w:t>3.</w:t>
-            </w:r>
-            <w:r>
-              <w:rPr>
-                <w:rFonts w:ascii="Times New Roman" w:hAnsi="Times New Roman" w:cs="Times New Roman"/>
-                <w:color w:val="000000"/>
-                <w:sz w:val="18"/>
-                <w:szCs w:val="18"/>
-                <w:lang w:val="sv-SE"/>
-              </w:rPr>
-              <w:t>7</w:t>
-            </w:r>
-          </w:p>
-        </w:tc>
-        <w:tc>
-          <w:tcPr>
-            <w:tcW w:w="1335" w:type="dxa"/>
-          </w:tcPr>
-          <w:p>
-            <w:pPr>
-              <w:autoSpaceDE w:val="0"/>
-              <w:spacing w:after="0" w:line="240" w:lineRule="auto"/>
-              <w:jc w:val="center"/>
-              <w:rPr>
-                <w:rFonts w:ascii="Times New Roman" w:hAnsi="Times New Roman" w:cs="Times New Roman"/>
-                <w:color w:val="000000"/>
-                <w:sz w:val="18"/>
-                <w:szCs w:val="18"/>
-                <w:lang w:val="sv-SE"/>
-              </w:rPr>
-            </w:pPr>
-            <w:r>
-              <w:rPr>
-                <w:rFonts w:ascii="Times New Roman" w:hAnsi="Times New Roman" w:cs="Times New Roman"/>
-                <w:color w:val="000000"/>
-                <w:sz w:val="18"/>
-                <w:szCs w:val="18"/>
-                <w:lang w:val="sv-SE"/>
-              </w:rPr>
-              <w:t>7</w:t>
-            </w:r>
-            <w:r>
-              <w:rPr>
-                <w:rFonts w:ascii="Times New Roman" w:hAnsi="Times New Roman" w:cs="Times New Roman"/>
-                <w:color w:val="000000"/>
-                <w:sz w:val="18"/>
-                <w:szCs w:val="18"/>
-                <w:lang w:val="sv-SE"/>
-              </w:rPr>
-              <w:t>,000</w:t>
+              <w:t>0.7</w:t>
+            </w:r>
+          </w:p>
+        </w:tc>
+        <w:tc>
+          <w:tcPr>
+            <w:tcW w:w="1335" w:type="dxa"/>
+          </w:tcPr>
+          <w:p>
+            <w:pPr>
+              <w:autoSpaceDE w:val="0"/>
+              <w:spacing w:after="0" w:line="240" w:lineRule="auto"/>
+              <w:jc w:val="center"/>
+              <w:rPr>
+                <w:rFonts w:ascii="Times New Roman" w:hAnsi="Times New Roman" w:cs="Times New Roman"/>
+                <w:color w:val="000000"/>
+                <w:sz w:val="18"/>
+                <w:szCs w:val="18"/>
+                <w:lang w:val="sv-SE"/>
+              </w:rPr>
+            </w:pPr>
+            <w:r>
+              <w:rPr>
+                <w:rFonts w:ascii="Times New Roman" w:hAnsi="Times New Roman" w:cs="Times New Roman"/>
+                <w:color w:val="000000"/>
+                <w:sz w:val="18"/>
+                <w:szCs w:val="18"/>
+                <w:lang w:val="sv-SE"/>
+              </w:rPr>
+              <w:t>3.7</w:t>
+            </w:r>
+          </w:p>
+        </w:tc>
+        <w:tc>
+          <w:tcPr>
+            <w:tcW w:w="1335" w:type="dxa"/>
+          </w:tcPr>
+          <w:p>
+            <w:pPr>
+              <w:autoSpaceDE w:val="0"/>
+              <w:spacing w:after="0" w:line="240" w:lineRule="auto"/>
+              <w:jc w:val="center"/>
+              <w:rPr>
+                <w:rFonts w:ascii="Times New Roman" w:hAnsi="Times New Roman" w:cs="Times New Roman"/>
+                <w:color w:val="000000"/>
+                <w:sz w:val="18"/>
+                <w:szCs w:val="18"/>
+                <w:lang w:val="sv-SE"/>
+              </w:rPr>
+            </w:pPr>
+            <w:r>
+              <w:rPr>
+                <w:rFonts w:ascii="Times New Roman" w:hAnsi="Times New Roman" w:cs="Times New Roman"/>
+                <w:color w:val="000000"/>
+                <w:sz w:val="18"/>
+                <w:szCs w:val="18"/>
+                <w:lang w:val="sv-SE"/>
+              </w:rPr>
+              <w:t>7,000</w:t>
             </w:r>
           </w:p>
         </w:tc>
@@ -27812,56 +27238,36 @@
                 <w:szCs w:val="18"/>
                 <w:lang w:val="sv-SE"/>
               </w:rPr>
-              <w:t>5</w:t>
-            </w:r>
-            <w:r>
-              <w:rPr>
-                <w:rFonts w:ascii="Times New Roman" w:hAnsi="Times New Roman" w:cs="Times New Roman"/>
-                <w:color w:val="000000"/>
-                <w:sz w:val="18"/>
-                <w:szCs w:val="18"/>
-                <w:lang w:val="sv-SE"/>
-              </w:rPr>
-              <w:t>4</w:t>
-            </w:r>
-          </w:p>
-        </w:tc>
-        <w:tc>
-          <w:tcPr>
-            <w:tcW w:w="1335" w:type="dxa"/>
-          </w:tcPr>
-          <w:p>
-            <w:pPr>
-              <w:autoSpaceDE w:val="0"/>
-              <w:spacing w:after="0" w:line="240" w:lineRule="auto"/>
-              <w:jc w:val="center"/>
-              <w:rPr>
-                <w:rFonts w:ascii="Times New Roman" w:hAnsi="Times New Roman" w:cs="Times New Roman"/>
-                <w:color w:val="000000"/>
-                <w:sz w:val="18"/>
-                <w:szCs w:val="18"/>
-                <w:lang w:val="sv-SE"/>
-              </w:rPr>
-            </w:pPr>
-            <w:r>
-              <w:rPr>
-                <w:rFonts w:ascii="Times New Roman" w:hAnsi="Times New Roman" w:cs="Times New Roman"/>
-                <w:color w:val="000000"/>
-                <w:sz w:val="18"/>
-                <w:szCs w:val="18"/>
-                <w:lang w:val="sv-SE"/>
-              </w:rPr>
-              <w:t>3</w:t>
-            </w:r>
-            <w:r>
-              <w:rPr>
-                <w:rFonts w:ascii="Times New Roman" w:hAnsi="Times New Roman" w:cs="Times New Roman"/>
-                <w:color w:val="000000"/>
-                <w:sz w:val="18"/>
-                <w:szCs w:val="18"/>
-                <w:lang w:val="sv-SE"/>
-              </w:rPr>
-              <w:t>.3</w:t>
+              <w:t>54</w:t>
+            </w:r>
+          </w:p>
+        </w:tc>
+        <w:tc>
+          <w:tcPr>
+            <w:tcW w:w="1335" w:type="dxa"/>
+          </w:tcPr>
+          <w:p>
+            <w:pPr>
+              <w:autoSpaceDE w:val="0"/>
+              <w:spacing w:after="0" w:line="240" w:lineRule="auto"/>
+              <w:jc w:val="center"/>
+              <w:rPr>
+                <w:rFonts w:ascii="Times New Roman" w:hAnsi="Times New Roman" w:cs="Times New Roman"/>
+                <w:color w:val="000000"/>
+                <w:sz w:val="18"/>
+                <w:szCs w:val="18"/>
+                <w:lang w:val="sv-SE"/>
+              </w:rPr>
+            </w:pPr>
+            <w:r>
+              <w:rPr>
+                <w:rFonts w:ascii="Times New Roman" w:hAnsi="Times New Roman" w:cs="Times New Roman"/>
+                <w:color w:val="000000"/>
+                <w:sz w:val="18"/>
+                <w:szCs w:val="18"/>
+                <w:lang w:val="sv-SE"/>
+              </w:rPr>
+              <w:t>3.3</w:t>
             </w:r>
           </w:p>
         </w:tc>
@@ -28320,17 +27726,7 @@
                 <w:szCs w:val="18"/>
                 <w:lang w:val="sv-SE"/>
               </w:rPr>
-              <w:t>5</w:t>
-            </w:r>
-            <w:r>
-              <w:rPr>
-                <w:rFonts w:ascii="Times New Roman" w:hAnsi="Times New Roman" w:cs="Times New Roman"/>
-                <w:color w:val="000000"/>
-                <w:sz w:val="18"/>
-                <w:szCs w:val="18"/>
-                <w:lang w:val="sv-SE"/>
-              </w:rPr>
-              <w:t>.0</w:t>
+              <w:t>5.0</w:t>
             </w:r>
           </w:p>
         </w:tc>
@@ -28564,27 +27960,7 @@
                 <w:szCs w:val="18"/>
                 <w:lang w:val="sv-SE"/>
               </w:rPr>
-              <w:t>1</w:t>
-            </w:r>
-            <w:r>
-              <w:rPr>
-                <w:rFonts w:ascii="Times New Roman" w:hAnsi="Times New Roman" w:cs="Times New Roman"/>
-                <w:color w:val="000000"/>
-                <w:sz w:val="18"/>
-                <w:szCs w:val="18"/>
-                <w:lang w:val="sv-SE"/>
-              </w:rPr>
-              <w:t>5</w:t>
-            </w:r>
-            <w:r>
-              <w:rPr>
-                <w:rFonts w:ascii="Times New Roman" w:hAnsi="Times New Roman" w:cs="Times New Roman"/>
-                <w:color w:val="000000"/>
-                <w:sz w:val="18"/>
-                <w:szCs w:val="18"/>
-                <w:lang w:val="sv-SE"/>
-              </w:rPr>
-              <w:t>,000</w:t>
+              <w:t>15,000</w:t>
             </w:r>
           </w:p>
         </w:tc>
@@ -31581,19 +30957,7 @@
                 <w:szCs w:val="18"/>
                 <w:lang w:val="sv-SE"/>
               </w:rPr>
-              <w:t xml:space="preserve">Genetic </w:t>
-            </w:r>
-            <w:r>
-              <w:rPr>
-                <w:rFonts w:ascii="Times New Roman" w:hAnsi="Times New Roman" w:cs="Times New Roman"/>
-                <w:i/>
-                <w:iCs/>
-                <w:color w:val="000000"/>
-                <w:sz w:val="18"/>
-                <w:szCs w:val="18"/>
-                <w:lang w:val="sv-SE"/>
-              </w:rPr>
-              <w:t>Algorithm</w:t>
+              <w:t>Genetic Algorithm</w:t>
             </w:r>
           </w:p>
         </w:tc>
@@ -34190,25 +33554,7 @@
                 <w:sz w:val="18"/>
                 <w:szCs w:val="18"/>
               </w:rPr>
-              <w:t>Yes</w:t>
-            </w:r>
-            <w:r>
-              <w:rPr>
-                <w:rFonts w:ascii="Times New Roman" w:hAnsi="Times New Roman" w:cs="Times New Roman"/>
-                <w:color w:val="000000"/>
-                <w:sz w:val="18"/>
-                <w:szCs w:val="18"/>
-              </w:rPr>
-              <w:t xml:space="preserve"> </w:t>
-            </w:r>
-            <w:r>
-              <w:rPr>
-                <w:rFonts w:ascii="Times New Roman" w:hAnsi="Times New Roman" w:cs="Times New Roman"/>
-                <w:color w:val="000000"/>
-                <w:sz w:val="18"/>
-                <w:szCs w:val="18"/>
-              </w:rPr>
-              <w:t>(p &lt; 0.05)</w:t>
+              <w:t>Yes (p &lt; 0.05)</w:t>
             </w:r>
           </w:p>
         </w:tc>
@@ -37992,17 +37338,7 @@
                 <w:szCs w:val="18"/>
                 <w:lang w:val="sv-SE"/>
               </w:rPr>
-              <w:t>Tota</w:t>
-            </w:r>
-            <w:r>
-              <w:rPr>
-                <w:rFonts w:ascii="Times New Roman" w:hAnsi="Times New Roman" w:cs="Times New Roman"/>
-                <w:color w:val="000000"/>
-                <w:sz w:val="18"/>
-                <w:szCs w:val="18"/>
-                <w:lang w:val="sv-SE"/>
-              </w:rPr>
-              <w:t>l Cost (Rp)</w:t>
+              <w:t>Total Cost (Rp)</w:t>
             </w:r>
           </w:p>
         </w:tc>
@@ -38089,76 +37425,36 @@
                 <w:szCs w:val="18"/>
                 <w:lang w:val="sv-SE"/>
               </w:rPr>
-              <w:t xml:space="preserve">Karbo </w:t>
-            </w:r>
-            <w:r>
-              <w:rPr>
-                <w:rFonts w:ascii="Times New Roman" w:hAnsi="Times New Roman" w:cs="Times New Roman"/>
-                <w:color w:val="000000"/>
-                <w:sz w:val="18"/>
-                <w:szCs w:val="18"/>
-                <w:lang w:val="sv-SE"/>
-              </w:rPr>
-              <w:t>(g)</w:t>
-            </w:r>
-          </w:p>
-        </w:tc>
-        <w:tc>
-          <w:tcPr>
-            <w:tcW w:w="1335" w:type="dxa"/>
-          </w:tcPr>
-          <w:p>
-            <w:pPr>
-              <w:autoSpaceDE w:val="0"/>
-              <w:spacing w:after="0" w:line="240" w:lineRule="auto"/>
-              <w:jc w:val="center"/>
-              <w:rPr>
-                <w:rFonts w:ascii="Times New Roman" w:hAnsi="Times New Roman" w:cs="Times New Roman"/>
-                <w:color w:val="000000"/>
-                <w:sz w:val="18"/>
-                <w:szCs w:val="18"/>
-                <w:lang w:val="sv-SE"/>
-              </w:rPr>
-            </w:pPr>
-            <w:r>
-              <w:rPr>
-                <w:rFonts w:ascii="Times New Roman" w:hAnsi="Times New Roman" w:cs="Times New Roman"/>
-                <w:color w:val="000000"/>
-                <w:sz w:val="18"/>
-                <w:szCs w:val="18"/>
-                <w:lang w:val="sv-SE"/>
-              </w:rPr>
-              <w:t xml:space="preserve">Minuman </w:t>
-            </w:r>
-            <w:r>
-              <w:rPr>
-                <w:rFonts w:ascii="Times New Roman" w:hAnsi="Times New Roman" w:cs="Times New Roman"/>
-                <w:color w:val="000000"/>
-                <w:sz w:val="18"/>
-                <w:szCs w:val="18"/>
-                <w:lang w:val="sv-SE"/>
-              </w:rPr>
-              <w:t>(</w:t>
-            </w:r>
-            <w:r>
-              <w:rPr>
-                <w:rFonts w:ascii="Times New Roman" w:hAnsi="Times New Roman" w:cs="Times New Roman"/>
-                <w:color w:val="000000"/>
-                <w:sz w:val="18"/>
-                <w:szCs w:val="18"/>
-                <w:lang w:val="sv-SE"/>
-              </w:rPr>
-              <w:t>ml</w:t>
-            </w:r>
-            <w:r>
-              <w:rPr>
-                <w:rFonts w:ascii="Times New Roman" w:hAnsi="Times New Roman" w:cs="Times New Roman"/>
-                <w:color w:val="000000"/>
-                <w:sz w:val="18"/>
-                <w:szCs w:val="18"/>
-                <w:lang w:val="sv-SE"/>
-              </w:rPr>
-              <w:t>)</w:t>
+              <w:t>Karbo (g)</w:t>
+            </w:r>
+          </w:p>
+        </w:tc>
+        <w:tc>
+          <w:tcPr>
+            <w:tcW w:w="1335" w:type="dxa"/>
+          </w:tcPr>
+          <w:p>
+            <w:pPr>
+              <w:autoSpaceDE w:val="0"/>
+              <w:spacing w:after="0" w:line="240" w:lineRule="auto"/>
+              <w:jc w:val="center"/>
+              <w:rPr>
+                <w:rFonts w:ascii="Times New Roman" w:hAnsi="Times New Roman" w:cs="Times New Roman"/>
+                <w:color w:val="000000"/>
+                <w:sz w:val="18"/>
+                <w:szCs w:val="18"/>
+                <w:lang w:val="sv-SE"/>
+              </w:rPr>
+            </w:pPr>
+            <w:r>
+              <w:rPr>
+                <w:rFonts w:ascii="Times New Roman" w:hAnsi="Times New Roman" w:cs="Times New Roman"/>
+                <w:color w:val="000000"/>
+                <w:sz w:val="18"/>
+                <w:szCs w:val="18"/>
+                <w:lang w:val="sv-SE"/>
+              </w:rPr>
+              <w:t>Minuman (ml)</w:t>
             </w:r>
           </w:p>
         </w:tc>
@@ -38422,17 +37718,7 @@
                 <w:szCs w:val="18"/>
                 <w:lang w:val="sv-SE"/>
               </w:rPr>
-              <w:t>Se</w:t>
-            </w:r>
-            <w:r>
-              <w:rPr>
-                <w:rFonts w:ascii="Times New Roman" w:hAnsi="Times New Roman" w:cs="Times New Roman"/>
-                <w:color w:val="000000"/>
-                <w:sz w:val="18"/>
-                <w:szCs w:val="18"/>
-                <w:lang w:val="sv-SE"/>
-              </w:rPr>
-              <w:t>lasa</w:t>
+              <w:t>Selasa</w:t>
             </w:r>
           </w:p>
         </w:tc>
@@ -39021,20 +38307,8 @@
                 <w:szCs w:val="18"/>
                 <w:lang w:val="en-ID"/>
               </w:rPr>
-              <w:t>(C</w:t>
-            </w:r>
-            <w:proofErr w:type="gramStart"/>
-            <w:r>
-              <w:rPr>
-                <w:rFonts w:ascii="Times New Roman" w:hAnsi="Times New Roman" w:cs="Times New Roman"/>
-                <w:color w:val="000000"/>
-                <w:sz w:val="18"/>
-                <w:szCs w:val="18"/>
-                <w:lang w:val="en-ID"/>
-              </w:rPr>
-              <w:t>6)*</w:t>
-            </w:r>
-            <w:proofErr w:type="gramEnd"/>
+              <w:t>(C6)*</w:t>
+            </w:r>
           </w:p>
         </w:tc>
       </w:tr>
@@ -39432,19 +38706,8 @@
                 <w:sz w:val="18"/>
                 <w:szCs w:val="18"/>
               </w:rPr>
-              <w:t>1 (C</w:t>
-            </w:r>
-            <w:proofErr w:type="gramStart"/>
-            <w:r>
-              <w:rPr>
-                <w:rFonts w:ascii="Times New Roman" w:hAnsi="Times New Roman" w:cs="Times New Roman"/>
-                <w:color w:val="000000"/>
-                <w:sz w:val="18"/>
-                <w:szCs w:val="18"/>
-              </w:rPr>
-              <w:t>6)*</w:t>
-            </w:r>
-            <w:proofErr w:type="gramEnd"/>
+              <w:t>1 (C6)*</w:t>
+            </w:r>
           </w:p>
         </w:tc>
       </w:tr>
@@ -44017,25 +43280,7 @@
           <w:sz w:val="20"/>
           <w:szCs w:val="20"/>
         </w:rPr>
-        <w:t>, vol. 8, no. 6, p. 4673, Dec. 2018, doi: 10.11591/</w:t>
-      </w:r>
-      <w:proofErr w:type="gramStart"/>
-      <w:r>
-        <w:rPr>
-          <w:rFonts w:ascii="Times New Roman" w:hAnsi="Times New Roman" w:cs="Times New Roman"/>
-          <w:sz w:val="20"/>
-          <w:szCs w:val="20"/>
-        </w:rPr>
-        <w:t>ijece.v8i6.pp</w:t>
-      </w:r>
-      <w:proofErr w:type="gramEnd"/>
-      <w:r>
-        <w:rPr>
-          <w:rFonts w:ascii="Times New Roman" w:hAnsi="Times New Roman" w:cs="Times New Roman"/>
-          <w:sz w:val="20"/>
-          <w:szCs w:val="20"/>
-        </w:rPr>
-        <w:t>4673-4683.</w:t>
+        <w:t>, vol. 8, no. 6, p. 4673, Dec. 2018, doi: 10.11591/ijece.v8i6.pp4673-4683.</w:t>
       </w:r>
     </w:p>
     <w:p>
@@ -44201,25 +43446,7 @@
           <w:szCs w:val="20"/>
         </w:rPr>
         <w:tab/>
-        <w:t xml:space="preserve">R. Andriani, A. Pujianto, A. Yaqin, H. A. Fatta, K. Kraugusteeliana, and I. H. Indriana, “Optimization </w:t>
-      </w:r>
-      <w:proofErr w:type="gramStart"/>
-      <w:r>
-        <w:rPr>
-          <w:rFonts w:ascii="Times New Roman" w:hAnsi="Times New Roman" w:cs="Times New Roman"/>
-          <w:sz w:val="20"/>
-          <w:szCs w:val="20"/>
-        </w:rPr>
-        <w:t>Of</w:t>
-      </w:r>
-      <w:proofErr w:type="gramEnd"/>
-      <w:r>
-        <w:rPr>
-          <w:rFonts w:ascii="Times New Roman" w:hAnsi="Times New Roman" w:cs="Times New Roman"/>
-          <w:sz w:val="20"/>
-          <w:szCs w:val="20"/>
-        </w:rPr>
-        <w:t xml:space="preserve"> Genetic Algorithm Using PSO In Food Menu Recommendation System,” in </w:t>
+        <w:t xml:space="preserve">R. Andriani, A. Pujianto, A. Yaqin, H. A. Fatta, K. Kraugusteeliana, and I. H. Indriana, “Optimization Of Genetic Algorithm Using PSO In Food Menu Recommendation System,” in </w:t>
       </w:r>
       <w:r>
         <w:rPr>
@@ -44275,7 +43502,47 @@
           <w:sz w:val="20"/>
           <w:szCs w:val="20"/>
         </w:rPr>
-        <w:t>Protein and Amino Acid Requirements in Human Nutrition: Report of a Joint WHO/FAO/UNU Expert Consultation</w:t>
+        <w:t>Protein and Amino Acid Requirements in Human Nutrition: Report of a Joint WHO/FAO</w:t>
+      </w:r>
+      <w:r>
+        <w:rPr>
+          <w:rFonts w:ascii="Times New Roman" w:hAnsi="Times New Roman" w:cs="Times New Roman"/>
+          <w:i/>
+          <w:iCs/>
+          <w:sz w:val="20"/>
+          <w:szCs w:val="20"/>
+        </w:rPr>
+        <w:t xml:space="preserve"> (Food and Agriculture Organi</w:t>
+      </w:r>
+      <w:r>
+        <w:rPr>
+          <w:rFonts w:ascii="Times New Roman" w:hAnsi="Times New Roman" w:cs="Times New Roman"/>
+          <w:i/>
+          <w:iCs/>
+          <w:sz w:val="20"/>
+          <w:szCs w:val="20"/>
+        </w:rPr>
+        <w:t>z</w:t>
+      </w:r>
+      <w:r>
+        <w:rPr>
+          <w:rFonts w:ascii="Times New Roman" w:hAnsi="Times New Roman" w:cs="Times New Roman"/>
+          <w:i/>
+          <w:iCs/>
+          <w:sz w:val="20"/>
+          <w:szCs w:val="20"/>
+        </w:rPr>
+        <w:t>ation)</w:t>
+      </w:r>
+      <w:r>
+        <w:rPr>
+          <w:rFonts w:ascii="Times New Roman" w:hAnsi="Times New Roman" w:cs="Times New Roman"/>
+          <w:i/>
+          <w:iCs/>
+          <w:sz w:val="20"/>
+          <w:szCs w:val="20"/>
+        </w:rPr>
+        <w:t>/UNU Expert Consultation</w:t>
       </w:r>
       <w:r>
         <w:rPr>
@@ -44302,6 +43569,7 @@
           <w:sz w:val="20"/>
           <w:szCs w:val="20"/>
         </w:rPr>
+        <w:lastRenderedPageBreak/>
         <w:t>[17]</w:t>
       </w:r>
       <w:r>
@@ -44311,16 +43579,7 @@
           <w:szCs w:val="20"/>
         </w:rPr>
         <w:tab/>
-        <w:t xml:space="preserve">M. I. Pratiwi, W. F. Mahmudy, and C. Dewi, “IMPLEMENTASI ALGORITMA GENETIKA </w:t>
-      </w:r>
-      <w:r>
-        <w:rPr>
-          <w:rFonts w:ascii="Times New Roman" w:hAnsi="Times New Roman" w:cs="Times New Roman"/>
-          <w:sz w:val="20"/>
-          <w:szCs w:val="20"/>
-        </w:rPr>
-        <w:lastRenderedPageBreak/>
-        <w:t>PADA OPTIMASI BIAYA PEMENUHAN KEBUTUHAN GIZI,” vol. 4, no. 6, 2014.</w:t>
+        <w:t>M. I. Pratiwi, W. F. Mahmudy, and C. Dewi, “IMPLEMENTASI ALGORITMA GENETIKA PADA OPTIMASI BIAYA PEMENUHAN KEBUTUHAN GIZI,” vol. 4, no. 6, 2014.</w:t>
       </w:r>
     </w:p>
     <w:p>
@@ -44346,167 +43605,7 @@
           <w:sz w:val="20"/>
           <w:szCs w:val="20"/>
         </w:rPr>
-        <w:t xml:space="preserve">D. </w:t>
-      </w:r>
-      <w:proofErr w:type="spellStart"/>
-      <w:r>
-        <w:rPr>
-          <w:rFonts w:ascii="Times New Roman" w:hAnsi="Times New Roman" w:cs="Times New Roman"/>
-          <w:color w:val="000000"/>
-          <w:sz w:val="20"/>
-          <w:szCs w:val="20"/>
-        </w:rPr>
-        <w:t>Hindayana</w:t>
-      </w:r>
-      <w:proofErr w:type="spellEnd"/>
-      <w:r>
-        <w:rPr>
-          <w:rFonts w:ascii="Times New Roman" w:hAnsi="Times New Roman" w:cs="Times New Roman"/>
-          <w:color w:val="000000"/>
-          <w:sz w:val="20"/>
-          <w:szCs w:val="20"/>
-        </w:rPr>
-        <w:t>, "</w:t>
-      </w:r>
-      <w:proofErr w:type="spellStart"/>
-      <w:r>
-        <w:rPr>
-          <w:rFonts w:ascii="Times New Roman" w:hAnsi="Times New Roman" w:cs="Times New Roman"/>
-          <w:color w:val="000000"/>
-          <w:sz w:val="20"/>
-          <w:szCs w:val="20"/>
-        </w:rPr>
-        <w:t>Kepala</w:t>
-      </w:r>
-      <w:proofErr w:type="spellEnd"/>
-      <w:r>
-        <w:rPr>
-          <w:rFonts w:ascii="Times New Roman" w:hAnsi="Times New Roman" w:cs="Times New Roman"/>
-          <w:color w:val="000000"/>
-          <w:sz w:val="20"/>
-          <w:szCs w:val="20"/>
-        </w:rPr>
-        <w:t xml:space="preserve"> BGN </w:t>
-      </w:r>
-      <w:proofErr w:type="spellStart"/>
-      <w:r>
-        <w:rPr>
-          <w:rFonts w:ascii="Times New Roman" w:hAnsi="Times New Roman" w:cs="Times New Roman"/>
-          <w:color w:val="000000"/>
-          <w:sz w:val="20"/>
-          <w:szCs w:val="20"/>
-        </w:rPr>
-        <w:t>sebut</w:t>
-      </w:r>
-      <w:proofErr w:type="spellEnd"/>
-      <w:r>
-        <w:rPr>
-          <w:rFonts w:ascii="Times New Roman" w:hAnsi="Times New Roman" w:cs="Times New Roman"/>
-          <w:color w:val="000000"/>
-          <w:sz w:val="20"/>
-          <w:szCs w:val="20"/>
-        </w:rPr>
-        <w:t xml:space="preserve"> 60 </w:t>
-      </w:r>
-      <w:proofErr w:type="spellStart"/>
-      <w:r>
-        <w:rPr>
-          <w:rFonts w:ascii="Times New Roman" w:hAnsi="Times New Roman" w:cs="Times New Roman"/>
-          <w:color w:val="000000"/>
-          <w:sz w:val="20"/>
-          <w:szCs w:val="20"/>
-        </w:rPr>
-        <w:t>persen</w:t>
-      </w:r>
-      <w:proofErr w:type="spellEnd"/>
-      <w:r>
-        <w:rPr>
-          <w:rFonts w:ascii="Times New Roman" w:hAnsi="Times New Roman" w:cs="Times New Roman"/>
-          <w:color w:val="000000"/>
-          <w:sz w:val="20"/>
-          <w:szCs w:val="20"/>
-        </w:rPr>
-        <w:t xml:space="preserve"> </w:t>
-      </w:r>
-      <w:proofErr w:type="spellStart"/>
-      <w:r>
-        <w:rPr>
-          <w:rFonts w:ascii="Times New Roman" w:hAnsi="Times New Roman" w:cs="Times New Roman"/>
-          <w:color w:val="000000"/>
-          <w:sz w:val="20"/>
-          <w:szCs w:val="20"/>
-        </w:rPr>
-        <w:t>anak</w:t>
-      </w:r>
-      <w:proofErr w:type="spellEnd"/>
-      <w:r>
-        <w:rPr>
-          <w:rFonts w:ascii="Times New Roman" w:hAnsi="Times New Roman" w:cs="Times New Roman"/>
-          <w:color w:val="000000"/>
-          <w:sz w:val="20"/>
-          <w:szCs w:val="20"/>
-        </w:rPr>
-        <w:t xml:space="preserve"> Indonesia </w:t>
-      </w:r>
-      <w:proofErr w:type="spellStart"/>
-      <w:r>
-        <w:rPr>
-          <w:rFonts w:ascii="Times New Roman" w:hAnsi="Times New Roman" w:cs="Times New Roman"/>
-          <w:color w:val="000000"/>
-          <w:sz w:val="20"/>
-          <w:szCs w:val="20"/>
-        </w:rPr>
-        <w:t>tidak</w:t>
-      </w:r>
-      <w:proofErr w:type="spellEnd"/>
-      <w:r>
-        <w:rPr>
-          <w:rFonts w:ascii="Times New Roman" w:hAnsi="Times New Roman" w:cs="Times New Roman"/>
-          <w:color w:val="000000"/>
-          <w:sz w:val="20"/>
-          <w:szCs w:val="20"/>
-        </w:rPr>
-        <w:t xml:space="preserve"> </w:t>
-      </w:r>
-      <w:proofErr w:type="spellStart"/>
-      <w:r>
-        <w:rPr>
-          <w:rFonts w:ascii="Times New Roman" w:hAnsi="Times New Roman" w:cs="Times New Roman"/>
-          <w:color w:val="000000"/>
-          <w:sz w:val="20"/>
-          <w:szCs w:val="20"/>
-        </w:rPr>
-        <w:t>mampu</w:t>
-      </w:r>
-      <w:proofErr w:type="spellEnd"/>
-      <w:r>
-        <w:rPr>
-          <w:rFonts w:ascii="Times New Roman" w:hAnsi="Times New Roman" w:cs="Times New Roman"/>
-          <w:color w:val="000000"/>
-          <w:sz w:val="20"/>
-          <w:szCs w:val="20"/>
-        </w:rPr>
-        <w:t xml:space="preserve"> </w:t>
-      </w:r>
-      <w:proofErr w:type="spellStart"/>
-      <w:r>
-        <w:rPr>
-          <w:rFonts w:ascii="Times New Roman" w:hAnsi="Times New Roman" w:cs="Times New Roman"/>
-          <w:color w:val="000000"/>
-          <w:sz w:val="20"/>
-          <w:szCs w:val="20"/>
-        </w:rPr>
-        <w:t>beli</w:t>
-      </w:r>
-      <w:proofErr w:type="spellEnd"/>
-      <w:r>
-        <w:rPr>
-          <w:rFonts w:ascii="Times New Roman" w:hAnsi="Times New Roman" w:cs="Times New Roman"/>
-          <w:color w:val="000000"/>
-          <w:sz w:val="20"/>
-          <w:szCs w:val="20"/>
-        </w:rPr>
-        <w:t xml:space="preserve"> susu," ANTARA News, June 16, 2025. [Online]. Available: https://www.antaranews.com</w:t>
+        <w:t>D. Hindayana, "Kepala BGN sebut 60 persen anak Indonesia tidak mampu beli susu," ANTARA News, June 16, 2025. [Online]. Available: https://www.antaranews.com</w:t>
       </w:r>
     </w:p>
     <w:p>
@@ -44532,107 +43631,7 @@
           <w:sz w:val="20"/>
           <w:szCs w:val="20"/>
         </w:rPr>
-        <w:t xml:space="preserve">Kementerian Kesehatan Republik Indonesia, "SSGI 2024: </w:t>
-      </w:r>
-      <w:proofErr w:type="spellStart"/>
-      <w:r>
-        <w:rPr>
-          <w:rFonts w:ascii="Times New Roman" w:hAnsi="Times New Roman" w:cs="Times New Roman"/>
-          <w:color w:val="000000"/>
-          <w:sz w:val="20"/>
-          <w:szCs w:val="20"/>
-        </w:rPr>
-        <w:t>Prevalensi</w:t>
-      </w:r>
-      <w:proofErr w:type="spellEnd"/>
-      <w:r>
-        <w:rPr>
-          <w:rFonts w:ascii="Times New Roman" w:hAnsi="Times New Roman" w:cs="Times New Roman"/>
-          <w:color w:val="000000"/>
-          <w:sz w:val="20"/>
-          <w:szCs w:val="20"/>
-        </w:rPr>
-        <w:t xml:space="preserve"> stunting </w:t>
-      </w:r>
-      <w:proofErr w:type="spellStart"/>
-      <w:r>
-        <w:rPr>
-          <w:rFonts w:ascii="Times New Roman" w:hAnsi="Times New Roman" w:cs="Times New Roman"/>
-          <w:color w:val="000000"/>
-          <w:sz w:val="20"/>
-          <w:szCs w:val="20"/>
-        </w:rPr>
-        <w:t>nasional</w:t>
-      </w:r>
-      <w:proofErr w:type="spellEnd"/>
-      <w:r>
-        <w:rPr>
-          <w:rFonts w:ascii="Times New Roman" w:hAnsi="Times New Roman" w:cs="Times New Roman"/>
-          <w:color w:val="000000"/>
-          <w:sz w:val="20"/>
-          <w:szCs w:val="20"/>
-        </w:rPr>
-        <w:t xml:space="preserve"> </w:t>
-      </w:r>
-      <w:proofErr w:type="spellStart"/>
-      <w:r>
-        <w:rPr>
-          <w:rFonts w:ascii="Times New Roman" w:hAnsi="Times New Roman" w:cs="Times New Roman"/>
-          <w:color w:val="000000"/>
-          <w:sz w:val="20"/>
-          <w:szCs w:val="20"/>
-        </w:rPr>
-        <w:t>turun</w:t>
-      </w:r>
-      <w:proofErr w:type="spellEnd"/>
-      <w:r>
-        <w:rPr>
-          <w:rFonts w:ascii="Times New Roman" w:hAnsi="Times New Roman" w:cs="Times New Roman"/>
-          <w:color w:val="000000"/>
-          <w:sz w:val="20"/>
-          <w:szCs w:val="20"/>
-        </w:rPr>
-        <w:t xml:space="preserve"> </w:t>
-      </w:r>
-      <w:proofErr w:type="spellStart"/>
-      <w:r>
-        <w:rPr>
-          <w:rFonts w:ascii="Times New Roman" w:hAnsi="Times New Roman" w:cs="Times New Roman"/>
-          <w:color w:val="000000"/>
-          <w:sz w:val="20"/>
-          <w:szCs w:val="20"/>
-        </w:rPr>
-        <w:t>menjadi</w:t>
-      </w:r>
-      <w:proofErr w:type="spellEnd"/>
-      <w:r>
-        <w:rPr>
-          <w:rFonts w:ascii="Times New Roman" w:hAnsi="Times New Roman" w:cs="Times New Roman"/>
-          <w:color w:val="000000"/>
-          <w:sz w:val="20"/>
-          <w:szCs w:val="20"/>
-        </w:rPr>
-        <w:t xml:space="preserve"> 19,8%," Badan </w:t>
-      </w:r>
-      <w:proofErr w:type="spellStart"/>
-      <w:r>
-        <w:rPr>
-          <w:rFonts w:ascii="Times New Roman" w:hAnsi="Times New Roman" w:cs="Times New Roman"/>
-          <w:color w:val="000000"/>
-          <w:sz w:val="20"/>
-          <w:szCs w:val="20"/>
-        </w:rPr>
-        <w:t>Kebijakan</w:t>
-      </w:r>
-      <w:proofErr w:type="spellEnd"/>
-      <w:r>
-        <w:rPr>
-          <w:rFonts w:ascii="Times New Roman" w:hAnsi="Times New Roman" w:cs="Times New Roman"/>
-          <w:color w:val="000000"/>
-          <w:sz w:val="20"/>
-          <w:szCs w:val="20"/>
-        </w:rPr>
-        <w:t xml:space="preserve"> Pembangunan Kesehatan, May 26, 2025. [Online]. Available: https://www.kemkes.go.id</w:t>
+        <w:t>Kementerian Kesehatan Republik Indonesia, "SSGI 2024: Prevalensi stunting nasional turun menjadi 19,8%," Badan Kebijakan Pembangunan Kesehatan, May 26, 2025. [Online]. Available: https://www.kemkes.go.id</w:t>
       </w:r>
     </w:p>
     <w:p>
@@ -44658,9 +43657,8 @@
           <w:sz w:val="20"/>
           <w:szCs w:val="20"/>
         </w:rPr>
-        <w:t xml:space="preserve">L. B. Sutanto, "21 </w:t>
-      </w:r>
-      <w:proofErr w:type="spellStart"/>
+        <w:t xml:space="preserve">L. B. Sutanto, "21 juta warga negara Indonesia kekurangan gizi," Media Indonesia, September 17, 2024. [Online]. Available: </w:t>
+      </w:r>
       <w:r>
         <w:rPr>
           <w:rFonts w:ascii="Times New Roman" w:hAnsi="Times New Roman" w:cs="Times New Roman"/>
@@ -44668,77 +43666,7 @@
           <w:sz w:val="20"/>
           <w:szCs w:val="20"/>
         </w:rPr>
-        <w:t>juta</w:t>
-      </w:r>
-      <w:proofErr w:type="spellEnd"/>
-      <w:r>
-        <w:rPr>
-          <w:rFonts w:ascii="Times New Roman" w:hAnsi="Times New Roman" w:cs="Times New Roman"/>
-          <w:color w:val="000000"/>
-          <w:sz w:val="20"/>
-          <w:szCs w:val="20"/>
-        </w:rPr>
-        <w:t xml:space="preserve"> </w:t>
-      </w:r>
-      <w:proofErr w:type="spellStart"/>
-      <w:r>
-        <w:rPr>
-          <w:rFonts w:ascii="Times New Roman" w:hAnsi="Times New Roman" w:cs="Times New Roman"/>
-          <w:color w:val="000000"/>
-          <w:sz w:val="20"/>
-          <w:szCs w:val="20"/>
-        </w:rPr>
-        <w:t>warga</w:t>
-      </w:r>
-      <w:proofErr w:type="spellEnd"/>
-      <w:r>
-        <w:rPr>
-          <w:rFonts w:ascii="Times New Roman" w:hAnsi="Times New Roman" w:cs="Times New Roman"/>
-          <w:color w:val="000000"/>
-          <w:sz w:val="20"/>
-          <w:szCs w:val="20"/>
-        </w:rPr>
-        <w:t xml:space="preserve"> negara Indonesia </w:t>
-      </w:r>
-      <w:proofErr w:type="spellStart"/>
-      <w:r>
-        <w:rPr>
-          <w:rFonts w:ascii="Times New Roman" w:hAnsi="Times New Roman" w:cs="Times New Roman"/>
-          <w:color w:val="000000"/>
-          <w:sz w:val="20"/>
-          <w:szCs w:val="20"/>
-        </w:rPr>
-        <w:t>kekurangan</w:t>
-      </w:r>
-      <w:proofErr w:type="spellEnd"/>
-      <w:r>
-        <w:rPr>
-          <w:rFonts w:ascii="Times New Roman" w:hAnsi="Times New Roman" w:cs="Times New Roman"/>
-          <w:color w:val="000000"/>
-          <w:sz w:val="20"/>
-          <w:szCs w:val="20"/>
-        </w:rPr>
-        <w:t xml:space="preserve"> </w:t>
-      </w:r>
-      <w:proofErr w:type="spellStart"/>
-      <w:r>
-        <w:rPr>
-          <w:rFonts w:ascii="Times New Roman" w:hAnsi="Times New Roman" w:cs="Times New Roman"/>
-          <w:color w:val="000000"/>
-          <w:sz w:val="20"/>
-          <w:szCs w:val="20"/>
-        </w:rPr>
-        <w:t>gizi</w:t>
-      </w:r>
-      <w:proofErr w:type="spellEnd"/>
-      <w:r>
-        <w:rPr>
-          <w:rFonts w:ascii="Times New Roman" w:hAnsi="Times New Roman" w:cs="Times New Roman"/>
-          <w:color w:val="000000"/>
-          <w:sz w:val="20"/>
-          <w:szCs w:val="20"/>
-        </w:rPr>
-        <w:t>," Media Indonesia, September 17, 2024. [Online]. Available: https://mediaindonesia.com</w:t>
+        <w:t>https://mediaindonesia.com/humaniora/701848/-21-juta-warga-negara-indonesia-kekurangan-gizi</w:t>
       </w:r>
     </w:p>
     <w:p>
@@ -44762,73 +43690,7 @@
           <w:sz w:val="20"/>
           <w:szCs w:val="20"/>
         </w:rPr>
-        <w:t xml:space="preserve">Kementerian Kesehatan Republik Indonesia, "Tabel </w:t>
-      </w:r>
-      <w:proofErr w:type="spellStart"/>
-      <w:r>
-        <w:rPr>
-          <w:rStyle w:val="cf01"/>
-          <w:rFonts w:ascii="Times New Roman" w:hAnsi="Times New Roman"/>
-          <w:color w:val="auto"/>
-          <w:sz w:val="20"/>
-          <w:szCs w:val="20"/>
-        </w:rPr>
-        <w:t>Komposisi</w:t>
-      </w:r>
-      <w:proofErr w:type="spellEnd"/>
-      <w:r>
-        <w:rPr>
-          <w:rStyle w:val="cf01"/>
-          <w:rFonts w:ascii="Times New Roman" w:hAnsi="Times New Roman"/>
-          <w:color w:val="auto"/>
-          <w:sz w:val="20"/>
-          <w:szCs w:val="20"/>
-        </w:rPr>
-        <w:t xml:space="preserve"> Pangan Indonesia 2017," </w:t>
-      </w:r>
-      <w:proofErr w:type="spellStart"/>
-      <w:r>
-        <w:rPr>
-          <w:rStyle w:val="cf01"/>
-          <w:rFonts w:ascii="Times New Roman" w:hAnsi="Times New Roman"/>
-          <w:color w:val="auto"/>
-          <w:sz w:val="20"/>
-          <w:szCs w:val="20"/>
-        </w:rPr>
-        <w:t>Direktorat</w:t>
-      </w:r>
-      <w:proofErr w:type="spellEnd"/>
-      <w:r>
-        <w:rPr>
-          <w:rStyle w:val="cf01"/>
-          <w:rFonts w:ascii="Times New Roman" w:hAnsi="Times New Roman"/>
-          <w:color w:val="auto"/>
-          <w:sz w:val="20"/>
-          <w:szCs w:val="20"/>
-        </w:rPr>
-        <w:t xml:space="preserve"> </w:t>
-      </w:r>
-      <w:proofErr w:type="spellStart"/>
-      <w:r>
-        <w:rPr>
-          <w:rStyle w:val="cf01"/>
-          <w:rFonts w:ascii="Times New Roman" w:hAnsi="Times New Roman"/>
-          <w:color w:val="auto"/>
-          <w:sz w:val="20"/>
-          <w:szCs w:val="20"/>
-        </w:rPr>
-        <w:t>Jenderal</w:t>
-      </w:r>
-      <w:proofErr w:type="spellEnd"/>
-      <w:r>
-        <w:rPr>
-          <w:rStyle w:val="cf01"/>
-          <w:rFonts w:ascii="Times New Roman" w:hAnsi="Times New Roman"/>
-          <w:color w:val="auto"/>
-          <w:sz w:val="20"/>
-          <w:szCs w:val="20"/>
-        </w:rPr>
-        <w:t xml:space="preserve"> Kesehatan Masyarakat, Jakarta, Indonesia, 2017. [Online]. Available: http://panganku.org/id-ID/view</w:t>
+        <w:t>Kementerian Kesehatan Republik Indonesia, "Tabel Komposisi Pangan Indonesia 2017," Direktorat Jenderal Kesehatan Masyarakat, Jakarta, Indonesia, 2017. [Online]. Available: http://panganku.org/id-ID/view</w:t>
       </w:r>
     </w:p>
     <w:p>
@@ -44855,147 +43717,7 @@
           <w:sz w:val="20"/>
           <w:szCs w:val="20"/>
         </w:rPr>
-        <w:t>Kementerian Kesehatan Republik Indonesia, "</w:t>
-      </w:r>
-      <w:proofErr w:type="spellStart"/>
-      <w:r>
-        <w:rPr>
-          <w:rFonts w:ascii="Times New Roman" w:hAnsi="Times New Roman" w:cs="Times New Roman"/>
-          <w:color w:val="000000"/>
-          <w:sz w:val="20"/>
-          <w:szCs w:val="20"/>
-        </w:rPr>
-        <w:t>Peraturan</w:t>
-      </w:r>
-      <w:proofErr w:type="spellEnd"/>
-      <w:r>
-        <w:rPr>
-          <w:rFonts w:ascii="Times New Roman" w:hAnsi="Times New Roman" w:cs="Times New Roman"/>
-          <w:color w:val="000000"/>
-          <w:sz w:val="20"/>
-          <w:szCs w:val="20"/>
-        </w:rPr>
-        <w:t xml:space="preserve"> Menteri Kesehatan Republik Indonesia </w:t>
-      </w:r>
-      <w:proofErr w:type="spellStart"/>
-      <w:r>
-        <w:rPr>
-          <w:rFonts w:ascii="Times New Roman" w:hAnsi="Times New Roman" w:cs="Times New Roman"/>
-          <w:color w:val="000000"/>
-          <w:sz w:val="20"/>
-          <w:szCs w:val="20"/>
-        </w:rPr>
-        <w:t>Nomor</w:t>
-      </w:r>
-      <w:proofErr w:type="spellEnd"/>
-      <w:r>
-        <w:rPr>
-          <w:rFonts w:ascii="Times New Roman" w:hAnsi="Times New Roman" w:cs="Times New Roman"/>
-          <w:color w:val="000000"/>
-          <w:sz w:val="20"/>
-          <w:szCs w:val="20"/>
-        </w:rPr>
-        <w:t xml:space="preserve"> 28 </w:t>
-      </w:r>
-      <w:proofErr w:type="spellStart"/>
-      <w:r>
-        <w:rPr>
-          <w:rFonts w:ascii="Times New Roman" w:hAnsi="Times New Roman" w:cs="Times New Roman"/>
-          <w:color w:val="000000"/>
-          <w:sz w:val="20"/>
-          <w:szCs w:val="20"/>
-        </w:rPr>
-        <w:t>Tahun</w:t>
-      </w:r>
-      <w:proofErr w:type="spellEnd"/>
-      <w:r>
-        <w:rPr>
-          <w:rFonts w:ascii="Times New Roman" w:hAnsi="Times New Roman" w:cs="Times New Roman"/>
-          <w:color w:val="000000"/>
-          <w:sz w:val="20"/>
-          <w:szCs w:val="20"/>
-        </w:rPr>
-        <w:t xml:space="preserve"> 2019 </w:t>
-      </w:r>
-      <w:proofErr w:type="spellStart"/>
-      <w:r>
-        <w:rPr>
-          <w:rFonts w:ascii="Times New Roman" w:hAnsi="Times New Roman" w:cs="Times New Roman"/>
-          <w:color w:val="000000"/>
-          <w:sz w:val="20"/>
-          <w:szCs w:val="20"/>
-        </w:rPr>
-        <w:t>tentang</w:t>
-      </w:r>
-      <w:proofErr w:type="spellEnd"/>
-      <w:r>
-        <w:rPr>
-          <w:rFonts w:ascii="Times New Roman" w:hAnsi="Times New Roman" w:cs="Times New Roman"/>
-          <w:color w:val="000000"/>
-          <w:sz w:val="20"/>
-          <w:szCs w:val="20"/>
-        </w:rPr>
-        <w:t xml:space="preserve"> Angka </w:t>
-      </w:r>
-      <w:proofErr w:type="spellStart"/>
-      <w:r>
-        <w:rPr>
-          <w:rFonts w:ascii="Times New Roman" w:hAnsi="Times New Roman" w:cs="Times New Roman"/>
-          <w:color w:val="000000"/>
-          <w:sz w:val="20"/>
-          <w:szCs w:val="20"/>
-        </w:rPr>
-        <w:t>Kecukupan</w:t>
-      </w:r>
-      <w:proofErr w:type="spellEnd"/>
-      <w:r>
-        <w:rPr>
-          <w:rFonts w:ascii="Times New Roman" w:hAnsi="Times New Roman" w:cs="Times New Roman"/>
-          <w:color w:val="000000"/>
-          <w:sz w:val="20"/>
-          <w:szCs w:val="20"/>
-        </w:rPr>
-        <w:t xml:space="preserve"> Gizi yang </w:t>
-      </w:r>
-      <w:proofErr w:type="spellStart"/>
-      <w:r>
-        <w:rPr>
-          <w:rFonts w:ascii="Times New Roman" w:hAnsi="Times New Roman" w:cs="Times New Roman"/>
-          <w:color w:val="000000"/>
-          <w:sz w:val="20"/>
-          <w:szCs w:val="20"/>
-        </w:rPr>
-        <w:t>Dianjurkan</w:t>
-      </w:r>
-      <w:proofErr w:type="spellEnd"/>
-      <w:r>
-        <w:rPr>
-          <w:rFonts w:ascii="Times New Roman" w:hAnsi="Times New Roman" w:cs="Times New Roman"/>
-          <w:color w:val="000000"/>
-          <w:sz w:val="20"/>
-          <w:szCs w:val="20"/>
-        </w:rPr>
-        <w:t xml:space="preserve"> </w:t>
-      </w:r>
-      <w:proofErr w:type="spellStart"/>
-      <w:r>
-        <w:rPr>
-          <w:rFonts w:ascii="Times New Roman" w:hAnsi="Times New Roman" w:cs="Times New Roman"/>
-          <w:color w:val="000000"/>
-          <w:sz w:val="20"/>
-          <w:szCs w:val="20"/>
-        </w:rPr>
-        <w:t>untuk</w:t>
-      </w:r>
-      <w:proofErr w:type="spellEnd"/>
-      <w:r>
-        <w:rPr>
-          <w:rFonts w:ascii="Times New Roman" w:hAnsi="Times New Roman" w:cs="Times New Roman"/>
-          <w:color w:val="000000"/>
-          <w:sz w:val="20"/>
-          <w:szCs w:val="20"/>
-        </w:rPr>
-        <w:t xml:space="preserve"> Masyarakat Indonesia," Jakarta, Indonesia, 2019. [Online]. Available: https://peraturan.bpk.go.id/Details/138621/permenkes-no-28-tahun-2019</w:t>
+        <w:t>Kementerian Kesehatan Republik Indonesia, "Peraturan Menteri Kesehatan Republik Indonesia Nomor 28 Tahun 2019 tentang Angka Kecukupan Gizi yang Dianjurkan untuk Masyarakat Indonesia," Jakarta, Indonesia, 2019. [Online]. Available: https://peraturan.bpk.go.id/Details/138621/permenkes-no-28-tahun-2019</w:t>
       </w:r>
     </w:p>
     <w:p>
@@ -45021,87 +43743,7 @@
           <w:sz w:val="20"/>
           <w:szCs w:val="20"/>
         </w:rPr>
-        <w:t xml:space="preserve">Badan Pusat </w:t>
-      </w:r>
-      <w:proofErr w:type="spellStart"/>
-      <w:r>
-        <w:rPr>
-          <w:rFonts w:ascii="Times New Roman" w:hAnsi="Times New Roman" w:cs="Times New Roman"/>
-          <w:color w:val="000000"/>
-          <w:sz w:val="20"/>
-          <w:szCs w:val="20"/>
-        </w:rPr>
-        <w:t>Statistik</w:t>
-      </w:r>
-      <w:proofErr w:type="spellEnd"/>
-      <w:r>
-        <w:rPr>
-          <w:rFonts w:ascii="Times New Roman" w:hAnsi="Times New Roman" w:cs="Times New Roman"/>
-          <w:color w:val="000000"/>
-          <w:sz w:val="20"/>
-          <w:szCs w:val="20"/>
-        </w:rPr>
-        <w:t xml:space="preserve">, "Garis </w:t>
-      </w:r>
-      <w:proofErr w:type="spellStart"/>
-      <w:r>
-        <w:rPr>
-          <w:rFonts w:ascii="Times New Roman" w:hAnsi="Times New Roman" w:cs="Times New Roman"/>
-          <w:color w:val="000000"/>
-          <w:sz w:val="20"/>
-          <w:szCs w:val="20"/>
-        </w:rPr>
-        <w:t>Kemiskinan</w:t>
-      </w:r>
-      <w:proofErr w:type="spellEnd"/>
-      <w:r>
-        <w:rPr>
-          <w:rFonts w:ascii="Times New Roman" w:hAnsi="Times New Roman" w:cs="Times New Roman"/>
-          <w:color w:val="000000"/>
-          <w:sz w:val="20"/>
-          <w:szCs w:val="20"/>
-        </w:rPr>
-        <w:t xml:space="preserve"> </w:t>
-      </w:r>
-      <w:proofErr w:type="spellStart"/>
-      <w:r>
-        <w:rPr>
-          <w:rFonts w:ascii="Times New Roman" w:hAnsi="Times New Roman" w:cs="Times New Roman"/>
-          <w:color w:val="000000"/>
-          <w:sz w:val="20"/>
-          <w:szCs w:val="20"/>
-        </w:rPr>
-        <w:t>Menurut</w:t>
-      </w:r>
-      <w:proofErr w:type="spellEnd"/>
-      <w:r>
-        <w:rPr>
-          <w:rFonts w:ascii="Times New Roman" w:hAnsi="Times New Roman" w:cs="Times New Roman"/>
-          <w:color w:val="000000"/>
-          <w:sz w:val="20"/>
-          <w:szCs w:val="20"/>
-        </w:rPr>
-        <w:t xml:space="preserve"> </w:t>
-      </w:r>
-      <w:proofErr w:type="spellStart"/>
-      <w:r>
-        <w:rPr>
-          <w:rFonts w:ascii="Times New Roman" w:hAnsi="Times New Roman" w:cs="Times New Roman"/>
-          <w:color w:val="000000"/>
-          <w:sz w:val="20"/>
-          <w:szCs w:val="20"/>
-        </w:rPr>
-        <w:t>Provinsi</w:t>
-      </w:r>
-      <w:proofErr w:type="spellEnd"/>
-      <w:r>
-        <w:rPr>
-          <w:rFonts w:ascii="Times New Roman" w:hAnsi="Times New Roman" w:cs="Times New Roman"/>
-          <w:color w:val="000000"/>
-          <w:sz w:val="20"/>
-          <w:szCs w:val="20"/>
-        </w:rPr>
-        <w:t xml:space="preserve"> 2023-2024," Jakarta, Indonesia, 2024. [Online]. Available: https://www.bps.go.id</w:t>
+        <w:t>Badan Pusat Statistik, "Garis Kemiskinan Menurut Provinsi 2023-2024," Jakarta, Indonesia, 2024. [Online]. Available: https://www.bps.go.id</w:t>
       </w:r>
     </w:p>
     <w:p>
@@ -45127,67 +43769,7 @@
           <w:sz w:val="20"/>
           <w:szCs w:val="20"/>
         </w:rPr>
-        <w:t>Kementerian Kesehatan Republik Indonesia, "</w:t>
-      </w:r>
-      <w:proofErr w:type="spellStart"/>
-      <w:r>
-        <w:rPr>
-          <w:rFonts w:ascii="Times New Roman" w:hAnsi="Times New Roman" w:cs="Times New Roman"/>
-          <w:color w:val="000000"/>
-          <w:sz w:val="20"/>
-          <w:szCs w:val="20"/>
-        </w:rPr>
-        <w:t>Pedoman</w:t>
-      </w:r>
-      <w:proofErr w:type="spellEnd"/>
-      <w:r>
-        <w:rPr>
-          <w:rFonts w:ascii="Times New Roman" w:hAnsi="Times New Roman" w:cs="Times New Roman"/>
-          <w:color w:val="000000"/>
-          <w:sz w:val="20"/>
-          <w:szCs w:val="20"/>
-        </w:rPr>
-        <w:t xml:space="preserve"> Gizi Seimbang," </w:t>
-      </w:r>
-      <w:proofErr w:type="spellStart"/>
-      <w:r>
-        <w:rPr>
-          <w:rFonts w:ascii="Times New Roman" w:hAnsi="Times New Roman" w:cs="Times New Roman"/>
-          <w:color w:val="000000"/>
-          <w:sz w:val="20"/>
-          <w:szCs w:val="20"/>
-        </w:rPr>
-        <w:t>Direktorat</w:t>
-      </w:r>
-      <w:proofErr w:type="spellEnd"/>
-      <w:r>
-        <w:rPr>
-          <w:rFonts w:ascii="Times New Roman" w:hAnsi="Times New Roman" w:cs="Times New Roman"/>
-          <w:color w:val="000000"/>
-          <w:sz w:val="20"/>
-          <w:szCs w:val="20"/>
-        </w:rPr>
-        <w:t xml:space="preserve"> </w:t>
-      </w:r>
-      <w:proofErr w:type="spellStart"/>
-      <w:r>
-        <w:rPr>
-          <w:rFonts w:ascii="Times New Roman" w:hAnsi="Times New Roman" w:cs="Times New Roman"/>
-          <w:color w:val="000000"/>
-          <w:sz w:val="20"/>
-          <w:szCs w:val="20"/>
-        </w:rPr>
-        <w:t>Jenderal</w:t>
-      </w:r>
-      <w:proofErr w:type="spellEnd"/>
-      <w:r>
-        <w:rPr>
-          <w:rFonts w:ascii="Times New Roman" w:hAnsi="Times New Roman" w:cs="Times New Roman"/>
-          <w:color w:val="000000"/>
-          <w:sz w:val="20"/>
-          <w:szCs w:val="20"/>
-        </w:rPr>
-        <w:t xml:space="preserve"> Bina Gizi dan Kesehatan Ibu dan Anak, Jakarta, Indonesia, 2014. [Online]. Available: http://gizi.depkes.go.id</w:t>
+        <w:t>Kementerian Kesehatan Republik Indonesia, "Pedoman Gizi Seimbang," Direktorat Jenderal Bina Gizi dan Kesehatan Ibu dan Anak, Jakarta, Indonesia, 2014. [Online]. Available: http://gizi.depkes.go.id</w:t>
       </w:r>
     </w:p>
     <w:p/>

</xml_diff>